<commit_message>
update resume for speculative inference
</commit_message>
<xml_diff>
--- a/resume/cai_shengcheng_resume.docx
+++ b/resume/cai_shengcheng_resume.docx
@@ -1,14 +1,19 @@
 
 <file path=word/document.xml><?xml version="1.0" encoding="utf-8"?>
-<w:document xmlns:wpc="http://schemas.microsoft.com/office/word/2010/wordprocessingCanvas" xmlns:mo="http://schemas.microsoft.com/office/mac/office/2008/main" xmlns:mc="http://schemas.openxmlformats.org/markup-compatibility/2006" xmlns:mv="urn:schemas-microsoft-com:mac:vml" xmlns:o="urn:schemas-microsoft-com:office:office" xmlns:r="http://schemas.openxmlformats.org/officeDocument/2006/relationships" xmlns:m="http://schemas.openxmlformats.org/officeDocument/2006/math" xmlns:v="urn:schemas-microsoft-com:vml" xmlns:wp14="http://schemas.microsoft.com/office/word/2010/wordprocessingDrawing" xmlns:wp="http://schemas.openxmlformats.org/drawingml/2006/wordprocessingDrawing" xmlns:w10="urn:schemas-microsoft-com:office:word" xmlns:w="http://schemas.openxmlformats.org/wordprocessingml/2006/main" xmlns:w14="http://schemas.microsoft.com/office/word/2010/wordml" xmlns:wpg="http://schemas.microsoft.com/office/word/2010/wordprocessingGroup" xmlns:wpi="http://schemas.microsoft.com/office/word/2010/wordprocessingInk" xmlns:wne="http://schemas.microsoft.com/office/word/2006/wordml" xmlns:wps="http://schemas.microsoft.com/office/word/2010/wordprocessingShape" mc:Ignorable="w14 wp14">
+<w:document xmlns:wpc="http://schemas.microsoft.com/office/word/2010/wordprocessingCanvas" xmlns:mc="http://schemas.openxmlformats.org/markup-compatibility/2006" xmlns:o="urn:schemas-microsoft-com:office:office" xmlns:r="http://schemas.openxmlformats.org/officeDocument/2006/relationships" xmlns:m="http://schemas.openxmlformats.org/officeDocument/2006/math" xmlns:v="urn:schemas-microsoft-com:vml" xmlns:wp14="http://schemas.microsoft.com/office/word/2010/wordprocessingDrawing" xmlns:wp="http://schemas.openxmlformats.org/drawingml/2006/wordprocessingDrawing" xmlns:w10="urn:schemas-microsoft-com:office:word" xmlns:w="http://schemas.openxmlformats.org/wordprocessingml/2006/main" xmlns:w14="http://schemas.microsoft.com/office/word/2010/wordml" xmlns:w15="http://schemas.microsoft.com/office/word/2012/wordml" xmlns:w16se="http://schemas.microsoft.com/office/word/2015/wordml/symex" xmlns:w16cid="http://schemas.microsoft.com/office/word/2016/wordml/cid" xmlns:w16="http://schemas.microsoft.com/office/word/2018/wordml" xmlns:w16cex="http://schemas.microsoft.com/office/word/2018/wordml/cex" xmlns:w16sdtdh="http://schemas.microsoft.com/office/word/2020/wordml/sdtdatahash" xmlns:wne="http://schemas.microsoft.com/office/word/2006/wordml" xmlns:wpg="http://schemas.microsoft.com/office/word/2010/wordprocessingGroup" xmlns:wps="http://schemas.microsoft.com/office/word/2010/wordprocessingShape" mc:Ignorable="w14 w15 w16se w16cid w16 w16cex w16sdtdh wp14">
   <w:body>
     <w:p>
+      <w:pPr>
+        <w:spacing w:after="200" w:line="276" w:lineRule="auto"/>
+      </w:pPr>
       <w:r>
         <w:rPr>
-          <w:rFonts w:ascii="Microsoft YaHei" w:hAnsi="Microsoft YaHei" w:eastAsia="Microsoft YaHei"/>
+          <w:rFonts w:ascii="Microsoft YaHei" w:hAnsi="Microsoft YaHei" w:eastAsia="Microsoft YaHei" w:cs="Microsoft YaHei"/>
           <w:b/>
+          <w:bCs/>
           <w:color w:val="003366"/>
           <w:sz w:val="40"/>
+          <w:szCs w:val="22"/>
         </w:rPr>
         <w:t>蔡圣诚</w:t>
       </w:r>
@@ -19,10 +24,10 @@
       </w:pPr>
       <w:r>
         <w:rPr>
-          <w:rFonts w:ascii="Microsoft YaHei" w:hAnsi="Microsoft YaHei" w:eastAsia="Microsoft YaHei"/>
-          <w:b w:val="0"/>
+          <w:rFonts w:ascii="Microsoft YaHei" w:hAnsi="Microsoft YaHei" w:eastAsia="Microsoft YaHei" w:cs="Microsoft YaHei"/>
           <w:color w:val="666666"/>
           <w:sz w:val="19"/>
+          <w:szCs w:val="22"/>
         </w:rPr>
         <w:t>求职方向：大模型推理工程师（量化推理 / 推理性能优化）</w:t>
       </w:r>
@@ -33,10 +38,10 @@
       </w:pPr>
       <w:r>
         <w:rPr>
-          <w:rFonts w:ascii="Microsoft YaHei" w:hAnsi="Microsoft YaHei" w:eastAsia="Microsoft YaHei"/>
-          <w:b w:val="0"/>
+          <w:rFonts w:ascii="Microsoft YaHei" w:hAnsi="Microsoft YaHei" w:eastAsia="Microsoft YaHei" w:cs="Microsoft YaHei"/>
           <w:color w:val="666666"/>
           <w:sz w:val="19"/>
+          <w:szCs w:val="22"/>
         </w:rPr>
         <w:t>杭州（可接受上海） | 15958033960 | cscznb5612@gmail.com</w:t>
       </w:r>
@@ -47,11 +52,11 @@
       </w:pPr>
       <w:r>
         <w:rPr>
-          <w:rFonts w:ascii="Microsoft YaHei" w:hAnsi="Microsoft YaHei" w:eastAsia="Microsoft YaHei"/>
-          <w:b w:val="0"/>
+          <w:rFonts w:ascii="Microsoft YaHei" w:hAnsi="Microsoft YaHei" w:eastAsia="Microsoft YaHei" w:cs="Microsoft YaHei"/>
           <w:sz w:val="20"/>
+          <w:szCs w:val="22"/>
         </w:rPr>
-        <w:t>4 年华为昇腾大模型推理研发经验，现任下一代模型量化工具负责人。主导 MXFP8/MXFP4 与 W4A4 低精度量化算法及推理落地，支撑 DeepSeek v4、Qwen3.5 等 20+ 权重在昇腾 A5 上线与客户送测；精度误差控制在 1% 以内，推理性能达竞品 1.x 倍，单模型适配周期压缩至 1 天。协同 4 部门 20+ 人完成推理引擎、量化算法与工具链端到端交付。</w:t>
+        <w:t>3 年华为昇腾大模型相关业务研发经验，现就职于昇腾计算开发部推理使能组，组内主要业务为大模型量化、投机推理、测评。本人现任Atlas 950代际大模型量化负责人，主导 MXFP8/MXFP4 与 W4A4 低精度量化算法开发及主流开源模型量化推理落地，支撑 20+ 模型权重在昇腾 950 代际上线与客户送测；精度误差控制在 1% 以内，推理性能达竞品 1.x 倍，单模型适配周期压缩至 1 天。协同 4 部门 20+ 人完成推理引擎、量化算法与工具链端到端交付。</w:t>
       </w:r>
     </w:p>
     <w:p>
@@ -60,10 +65,12 @@
       </w:pPr>
       <w:r>
         <w:rPr>
-          <w:rFonts w:ascii="Microsoft YaHei" w:hAnsi="Microsoft YaHei" w:eastAsia="Microsoft YaHei"/>
+          <w:rFonts w:ascii="Microsoft YaHei" w:hAnsi="Microsoft YaHei" w:eastAsia="Microsoft YaHei" w:cs="Microsoft YaHei"/>
           <w:b/>
+          <w:bCs/>
           <w:color w:val="003366"/>
           <w:sz w:val="22"/>
+          <w:szCs w:val="22"/>
         </w:rPr>
         <w:t>专业技能</w:t>
       </w:r>
@@ -74,20 +81,22 @@
       </w:pPr>
       <w:r>
         <w:rPr>
-          <w:rFonts w:ascii="Microsoft YaHei" w:hAnsi="Microsoft YaHei" w:eastAsia="Microsoft YaHei"/>
+          <w:rFonts w:ascii="Microsoft YaHei" w:hAnsi="Microsoft YaHei" w:eastAsia="Microsoft YaHei" w:cs="Microsoft YaHei"/>
           <w:b/>
+          <w:bCs/>
           <w:color w:val="003366"/>
           <w:sz w:val="20"/>
+          <w:szCs w:val="22"/>
         </w:rPr>
         <w:t>编程基础：</w:t>
       </w:r>
       <w:r>
         <w:rPr>
-          <w:rFonts w:ascii="Microsoft YaHei" w:hAnsi="Microsoft YaHei" w:eastAsia="Microsoft YaHei"/>
-          <w:b w:val="0"/>
+          <w:rFonts w:ascii="Microsoft YaHei" w:hAnsi="Microsoft YaHei" w:eastAsia="Microsoft YaHei" w:cs="Microsoft YaHei"/>
           <w:sz w:val="20"/>
+          <w:szCs w:val="22"/>
         </w:rPr>
-        <w:t>Python、C/C++（11 标准及以上），熟悉常用数据结构与面向对象设计</w:t>
+        <w:t>Python，C++，熟悉常用数据结构与面向对象设计</w:t>
       </w:r>
     </w:p>
     <w:p>
@@ -96,20 +105,22 @@
       </w:pPr>
       <w:r>
         <w:rPr>
-          <w:rFonts w:ascii="Microsoft YaHei" w:hAnsi="Microsoft YaHei" w:eastAsia="Microsoft YaHei"/>
+          <w:rFonts w:ascii="Microsoft YaHei" w:hAnsi="Microsoft YaHei" w:eastAsia="Microsoft YaHei" w:cs="Microsoft YaHei"/>
           <w:b/>
+          <w:bCs/>
           <w:color w:val="003366"/>
           <w:sz w:val="20"/>
+          <w:szCs w:val="22"/>
         </w:rPr>
         <w:t>深度学习：</w:t>
       </w:r>
       <w:r>
         <w:rPr>
-          <w:rFonts w:ascii="Microsoft YaHei" w:hAnsi="Microsoft YaHei" w:eastAsia="Microsoft YaHei"/>
-          <w:b w:val="0"/>
+          <w:rFonts w:ascii="Microsoft YaHei" w:hAnsi="Microsoft YaHei" w:eastAsia="Microsoft YaHei" w:cs="Microsoft YaHei"/>
           <w:sz w:val="20"/>
+          <w:szCs w:val="22"/>
         </w:rPr>
-        <w:t>PyTorch 大模型推理 Pipeline 构建，核心模块 PTQ 量化与性能调优</w:t>
+        <w:t>PyTorch 大模型推理，核心模块 PTQ 量化与性能、精度调优</w:t>
       </w:r>
     </w:p>
     <w:p>
@@ -118,20 +129,22 @@
       </w:pPr>
       <w:r>
         <w:rPr>
-          <w:rFonts w:ascii="Microsoft YaHei" w:hAnsi="Microsoft YaHei" w:eastAsia="Microsoft YaHei"/>
+          <w:rFonts w:ascii="Microsoft YaHei" w:hAnsi="Microsoft YaHei" w:eastAsia="Microsoft YaHei" w:cs="Microsoft YaHei"/>
           <w:b/>
+          <w:bCs/>
           <w:color w:val="003366"/>
           <w:sz w:val="20"/>
+          <w:szCs w:val="22"/>
         </w:rPr>
         <w:t>量化算法：</w:t>
       </w:r>
       <w:r>
         <w:rPr>
-          <w:rFonts w:ascii="Microsoft YaHei" w:hAnsi="Microsoft YaHei" w:eastAsia="Microsoft YaHei"/>
-          <w:b w:val="0"/>
+          <w:rFonts w:ascii="Microsoft YaHei" w:hAnsi="Microsoft YaHei" w:eastAsia="Microsoft YaHei" w:cs="Microsoft YaHei"/>
           <w:sz w:val="20"/>
+          <w:szCs w:val="22"/>
         </w:rPr>
-        <w:t>MXFP8/MXFP4、SVDQuant、二级量化、MSE Round、W4A4 PTQ；熟悉 AWQ/GPTQ/SmoothQuant 等 PTQ 范式</w:t>
+        <w:t>MXFP8/MXFP4、SVDQuant、二级量化、MSE Round、W4A4低精量化、Attention量化；熟悉 AWQ/GPTQ/SmoothQuant/autoround 等业界主流PTQ量化算法</w:t>
       </w:r>
     </w:p>
     <w:p>
@@ -140,18 +153,20 @@
       </w:pPr>
       <w:r>
         <w:rPr>
-          <w:rFonts w:ascii="Microsoft YaHei" w:hAnsi="Microsoft YaHei" w:eastAsia="Microsoft YaHei"/>
+          <w:rFonts w:ascii="Microsoft YaHei" w:hAnsi="Microsoft YaHei" w:eastAsia="Microsoft YaHei" w:cs="Microsoft YaHei"/>
           <w:b/>
+          <w:bCs/>
           <w:color w:val="003366"/>
           <w:sz w:val="20"/>
+          <w:szCs w:val="22"/>
         </w:rPr>
         <w:t>推理优化：</w:t>
       </w:r>
       <w:r>
         <w:rPr>
-          <w:rFonts w:ascii="Microsoft YaHei" w:hAnsi="Microsoft YaHei" w:eastAsia="Microsoft YaHei"/>
-          <w:b w:val="0"/>
+          <w:rFonts w:ascii="Microsoft YaHei" w:hAnsi="Microsoft YaHei" w:eastAsia="Microsoft YaHei" w:cs="Microsoft YaHei"/>
           <w:sz w:val="20"/>
+          <w:szCs w:val="22"/>
         </w:rPr>
         <w:t>量化算子实现、Model-free 权重转换、推理引擎协同优化、0-day 模型适配</w:t>
       </w:r>
@@ -162,20 +177,22 @@
       </w:pPr>
       <w:r>
         <w:rPr>
-          <w:rFonts w:ascii="Microsoft YaHei" w:hAnsi="Microsoft YaHei" w:eastAsia="Microsoft YaHei"/>
+          <w:rFonts w:ascii="Microsoft YaHei" w:hAnsi="Microsoft YaHei" w:eastAsia="Microsoft YaHei" w:cs="Microsoft YaHei"/>
           <w:b/>
+          <w:bCs/>
           <w:color w:val="003366"/>
           <w:sz w:val="20"/>
+          <w:szCs w:val="22"/>
         </w:rPr>
-        <w:t>通信与算子：</w:t>
+        <w:t>算子开发：</w:t>
       </w:r>
       <w:r>
         <w:rPr>
-          <w:rFonts w:ascii="Microsoft YaHei" w:hAnsi="Microsoft YaHei" w:eastAsia="Microsoft YaHei"/>
-          <w:b w:val="0"/>
+          <w:rFonts w:ascii="Microsoft YaHei" w:hAnsi="Microsoft YaHei" w:eastAsia="Microsoft YaHei" w:cs="Microsoft YaHei"/>
           <w:sz w:val="20"/>
+          <w:szCs w:val="22"/>
         </w:rPr>
-        <w:t>多卡通信算子调试（Allreduce 等）、Ascend C 算子开发与上板调试</w:t>
+        <w:t>Ascend C 算子开发与上板调试（NPU Debugger）</w:t>
       </w:r>
     </w:p>
     <w:p>
@@ -184,40 +201,50 @@
       </w:pPr>
       <w:r>
         <w:rPr>
-          <w:rFonts w:ascii="Microsoft YaHei" w:hAnsi="Microsoft YaHei" w:eastAsia="Microsoft YaHei"/>
+          <w:rFonts w:ascii="Microsoft YaHei" w:hAnsi="Microsoft YaHei" w:eastAsia="Microsoft YaHei" w:cs="Microsoft YaHei"/>
           <w:b/>
+          <w:bCs/>
           <w:color w:val="003366"/>
           <w:sz w:val="22"/>
+          <w:szCs w:val="22"/>
         </w:rPr>
         <w:t>工作经历</w:t>
       </w:r>
     </w:p>
     <w:p>
+      <w:pPr>
+        <w:spacing w:after="200" w:line="276" w:lineRule="auto"/>
+      </w:pPr>
       <w:r>
         <w:rPr>
-          <w:rFonts w:ascii="Microsoft YaHei" w:hAnsi="Microsoft YaHei" w:eastAsia="Microsoft YaHei"/>
+          <w:rFonts w:ascii="Microsoft YaHei" w:hAnsi="Microsoft YaHei" w:eastAsia="Microsoft YaHei" w:cs="Microsoft YaHei"/>
           <w:b/>
+          <w:bCs/>
           <w:sz w:val="22"/>
+          <w:szCs w:val="22"/>
         </w:rPr>
         <w:t>华为技术有限公司</w:t>
       </w:r>
       <w:r>
         <w:rPr>
-          <w:rFonts w:ascii="Microsoft YaHei" w:hAnsi="Microsoft YaHei" w:eastAsia="Microsoft YaHei"/>
-          <w:b w:val="0"/>
+          <w:rFonts w:ascii="Microsoft YaHei" w:hAnsi="Microsoft YaHei" w:eastAsia="Microsoft YaHei" w:cs="Microsoft YaHei"/>
           <w:color w:val="666666"/>
           <w:sz w:val="20"/>
+          <w:szCs w:val="22"/>
         </w:rPr>
         <w:t xml:space="preserve">    2022.02 — 至今</w:t>
       </w:r>
     </w:p>
     <w:p>
+      <w:pPr>
+        <w:spacing w:after="200" w:line="276" w:lineRule="auto"/>
+      </w:pPr>
       <w:r>
         <w:rPr>
-          <w:rFonts w:ascii="Microsoft YaHei" w:hAnsi="Microsoft YaHei" w:eastAsia="Microsoft YaHei"/>
-          <w:b w:val="0"/>
+          <w:rFonts w:ascii="Microsoft YaHei" w:hAnsi="Microsoft YaHei" w:eastAsia="Microsoft YaHei" w:cs="Microsoft YaHei"/>
           <w:color w:val="555555"/>
           <w:sz w:val="20"/>
+          <w:szCs w:val="22"/>
         </w:rPr>
         <w:t>高级工程师 · 昇腾大模型推理 / 量化</w:t>
       </w:r>
@@ -228,9 +255,11 @@
       </w:pPr>
       <w:r>
         <w:rPr>
-          <w:rFonts w:ascii="Microsoft YaHei" w:hAnsi="Microsoft YaHei" w:eastAsia="Microsoft YaHei"/>
+          <w:rFonts w:ascii="Microsoft YaHei" w:hAnsi="Microsoft YaHei" w:eastAsia="Microsoft YaHei" w:cs="Microsoft YaHei"/>
           <w:b/>
+          <w:bCs/>
           <w:sz w:val="21"/>
+          <w:szCs w:val="22"/>
         </w:rPr>
         <w:t>大模型量化推理（项目负责人）</w:t>
       </w:r>
@@ -239,70 +268,76 @@
       <w:pPr>
         <w:pStyle w:val="ListBullet"/>
         <w:spacing w:after="60"/>
-        <w:ind w:left="283"/>
+        <w:ind w:left="283" w:hanging="360"/>
       </w:pPr>
       <w:r>
         <w:rPr>
-          <w:rFonts w:ascii="Microsoft YaHei" w:hAnsi="Microsoft YaHei" w:eastAsia="Microsoft YaHei"/>
+          <w:rFonts w:ascii="Microsoft YaHei" w:hAnsi="Microsoft YaHei" w:eastAsia="Microsoft YaHei" w:cs="Microsoft YaHei"/>
           <w:b/>
+          <w:bCs/>
           <w:color w:val="003366"/>
           <w:sz w:val="21"/>
+          <w:szCs w:val="22"/>
         </w:rPr>
         <w:t>MXFP 量化落地：</w:t>
       </w:r>
       <w:r>
         <w:rPr>
-          <w:rFonts w:ascii="Microsoft YaHei" w:hAnsi="Microsoft YaHei" w:eastAsia="Microsoft YaHei"/>
-          <w:b w:val="0"/>
+          <w:rFonts w:ascii="Microsoft YaHei" w:hAnsi="Microsoft YaHei" w:eastAsia="Microsoft YaHei" w:cs="Microsoft YaHei"/>
           <w:sz w:val="21"/>
+          <w:szCs w:val="22"/>
         </w:rPr>
-        <w:t>主导 MXFP8、MXFP4 算法设计与实现，支撑 Qwen、DeepSeek、GLM、LongCat、Kimi、Minimax 等 20+ 权重在昇腾 A5 NPU 上线及客户送测；对 DeepSeek v4、Qwen3.5 实现 0-day 量化适配。精度相对浮点误差 &lt;1%，推理性能达竞品 1.x 倍，单模型适配 + 精度调优周期约 1 天。</w:t>
+        <w:t>主导 MXFP8、MXFP4 算法设计与实现，支撑 Qwen、DeepSeek、GLM、LongCat、Kimi、Minimax 等 20+ 权重在昇腾 A5 NPU 上线及客户送测；对 DeepSeek v4、Qwen3.5 实现 0-day 量化适配。精度相对浮点误差 &lt;1%，推理性能达竞品 1.x 倍，单模型适配约 1 天，整体调优周级完成。</w:t>
       </w:r>
     </w:p>
     <w:p>
       <w:pPr>
         <w:pStyle w:val="ListBullet"/>
         <w:spacing w:after="60"/>
-        <w:ind w:left="283"/>
+        <w:ind w:left="283" w:hanging="360"/>
       </w:pPr>
       <w:r>
         <w:rPr>
-          <w:rFonts w:ascii="Microsoft YaHei" w:hAnsi="Microsoft YaHei" w:eastAsia="Microsoft YaHei"/>
+          <w:rFonts w:ascii="Microsoft YaHei" w:hAnsi="Microsoft YaHei" w:eastAsia="Microsoft YaHei" w:cs="Microsoft YaHei"/>
           <w:b/>
+          <w:bCs/>
           <w:color w:val="003366"/>
           <w:sz w:val="21"/>
+          <w:szCs w:val="22"/>
         </w:rPr>
         <w:t>W4A4 低精度量化：</w:t>
       </w:r>
       <w:r>
         <w:rPr>
-          <w:rFonts w:ascii="Microsoft YaHei" w:hAnsi="Microsoft YaHei" w:eastAsia="Microsoft YaHei"/>
-          <w:b w:val="0"/>
+          <w:rFonts w:ascii="Microsoft YaHei" w:hAnsi="Microsoft YaHei" w:eastAsia="Microsoft YaHei" w:cs="Microsoft YaHei"/>
           <w:sz w:val="21"/>
+          <w:szCs w:val="22"/>
         </w:rPr>
-        <w:t>主导 SVDQuant、二级量化、MSE Round、C7 等 4bit 方案，在 Wan2.2 上完成 W4A4 量化；VBench 精度指标误差均 &lt;0.01，推理性能达竞品 1.x 倍，相对浮点精度损失 &lt;1%。</w:t>
+        <w:t>主导 SVDQuant、二级量化、MSE Round、C7 等 4bit 方案，在开源多模态大模型 （Wan2.2、Qwen-Image-Edit等） 上完成 W4A4 量化；VBench or Gedit 精度指标误差均 &lt;0.01，推理性能达竞品 1.x 倍。</w:t>
       </w:r>
     </w:p>
     <w:p>
       <w:pPr>
         <w:pStyle w:val="ListBullet"/>
         <w:spacing w:after="60"/>
-        <w:ind w:left="283"/>
+        <w:ind w:left="283" w:hanging="360"/>
       </w:pPr>
       <w:r>
         <w:rPr>
-          <w:rFonts w:ascii="Microsoft YaHei" w:hAnsi="Microsoft YaHei" w:eastAsia="Microsoft YaHei"/>
+          <w:rFonts w:ascii="Microsoft YaHei" w:hAnsi="Microsoft YaHei" w:eastAsia="Microsoft YaHei" w:cs="Microsoft YaHei"/>
           <w:b/>
+          <w:bCs/>
           <w:color w:val="003366"/>
           <w:sz w:val="21"/>
+          <w:szCs w:val="22"/>
         </w:rPr>
         <w:t>动态 PTQ 转换：</w:t>
       </w:r>
       <w:r>
         <w:rPr>
-          <w:rFonts w:ascii="Microsoft YaHei" w:hAnsi="Microsoft YaHei" w:eastAsia="Microsoft YaHei"/>
-          <w:b w:val="0"/>
+          <w:rFonts w:ascii="Microsoft YaHei" w:hAnsi="Microsoft YaHei" w:eastAsia="Microsoft YaHei" w:cs="Microsoft YaHei"/>
           <w:sz w:val="21"/>
+          <w:szCs w:val="22"/>
         </w:rPr>
         <w:t>实现 Model-free 权重转换能力，在 PTQ 动态场景下以轻量化流程完成权重量化，降低大模型迁移与推理部署成本。</w:t>
       </w:r>
@@ -311,24 +346,60 @@
       <w:pPr>
         <w:pStyle w:val="ListBullet"/>
         <w:spacing w:after="60"/>
-        <w:ind w:left="283"/>
+        <w:ind w:left="283" w:hanging="360"/>
       </w:pPr>
       <w:r>
         <w:rPr>
-          <w:rFonts w:ascii="Microsoft YaHei" w:hAnsi="Microsoft YaHei" w:eastAsia="Microsoft YaHei"/>
+          <w:rFonts w:ascii="Microsoft YaHei" w:hAnsi="Microsoft YaHei" w:eastAsia="Microsoft YaHei" w:cs="Microsoft YaHei"/>
           <w:b/>
+          <w:bCs/>
           <w:color w:val="003366"/>
           <w:sz w:val="21"/>
+          <w:szCs w:val="22"/>
         </w:rPr>
         <w:t>端到端项目交付：</w:t>
       </w:r>
       <w:r>
         <w:rPr>
-          <w:rFonts w:ascii="Microsoft YaHei" w:hAnsi="Microsoft YaHei" w:eastAsia="Microsoft YaHei"/>
-          <w:b w:val="0"/>
+          <w:rFonts w:ascii="Microsoft YaHei" w:hAnsi="Microsoft YaHei" w:eastAsia="Microsoft YaHei" w:cs="Microsoft YaHei"/>
           <w:sz w:val="21"/>
+          <w:szCs w:val="22"/>
         </w:rPr>
         <w:t>作为负责人协同推理引擎、量化算法、量化工具 4 个部门 20+ 人推进交付，保障客户面送测通过；相较上一代引入浮点量化体系并扩展 4bit 低精度算法矩阵，参与关键方案设计与路线决策。</w:t>
+      </w:r>
+    </w:p>
+    <w:p>
+      <w:pPr>
+        <w:pStyle w:val="ListBullet"/>
+        <w:spacing w:after="60"/>
+        <w:ind w:left="360" w:hanging="360"/>
+      </w:pPr>
+      <w:r>
+        <w:rPr>
+          <w:rFonts w:ascii="Microsoft YaHei" w:hAnsi="Microsoft YaHei" w:eastAsia="Microsoft YaHei" w:cs="Microsoft YaHei"/>
+          <w:b/>
+          <w:bCs/>
+          <w:color w:val="003366"/>
+          <w:sz w:val="21"/>
+          <w:szCs w:val="22"/>
+        </w:rPr>
+        <w:t>投机推理：</w:t>
+      </w:r>
+      <w:r>
+        <w:rPr>
+          <w:rFonts w:ascii="Microsoft YaHei" w:hAnsi="Cambria" w:eastAsia="ＭＳ 明朝" w:cs="Microsoft YaHei" w:hAnsiTheme="minorHAnsi" w:eastAsiaTheme="minorEastAsia"/>
+          <w:sz w:val="21"/>
+          <w:szCs w:val="21"/>
+        </w:rPr>
+        <w:t>主要负责DeepSeek v4 flash/pro DSpark 权重的0 day 4bit量化适配。并且</w:t>
+      </w:r>
+      <w:r>
+        <w:rPr>
+          <w:rFonts w:ascii="Microsoft YaHei" w:hAnsi="Microsoft YaHei" w:eastAsia="Microsoft YaHei" w:cs="Microsoft YaHei"/>
+          <w:sz w:val="21"/>
+          <w:szCs w:val="22"/>
+        </w:rPr>
+        <w:t>基于 DeepSeek 开源 DeepSpec，参与完成 910B npu芯片上的 DSpark 训练→GSM8K eval 全链路验证。</w:t>
       </w:r>
     </w:p>
     <w:p>
@@ -337,9 +408,11 @@
       </w:pPr>
       <w:r>
         <w:rPr>
-          <w:rFonts w:ascii="Microsoft YaHei" w:hAnsi="Microsoft YaHei" w:eastAsia="Microsoft YaHei"/>
+          <w:rFonts w:ascii="Microsoft YaHei" w:hAnsi="Microsoft YaHei" w:eastAsia="Microsoft YaHei" w:cs="Microsoft YaHei"/>
           <w:b/>
+          <w:bCs/>
           <w:sz w:val="21"/>
+          <w:szCs w:val="22"/>
         </w:rPr>
         <w:t>昇腾算子调试工具</w:t>
       </w:r>
@@ -348,22 +421,24 @@
       <w:pPr>
         <w:pStyle w:val="ListBullet"/>
         <w:spacing w:after="60"/>
-        <w:ind w:left="283"/>
+        <w:ind w:left="283" w:hanging="360"/>
       </w:pPr>
       <w:r>
         <w:rPr>
-          <w:rFonts w:ascii="Microsoft YaHei" w:hAnsi="Microsoft YaHei" w:eastAsia="Microsoft YaHei"/>
+          <w:rFonts w:ascii="Microsoft YaHei" w:hAnsi="Microsoft YaHei" w:eastAsia="Microsoft YaHei" w:cs="Microsoft YaHei"/>
           <w:b/>
+          <w:bCs/>
           <w:color w:val="003366"/>
           <w:sz w:val="21"/>
+          <w:szCs w:val="22"/>
         </w:rPr>
         <w:t>上板调试与生态：</w:t>
       </w:r>
       <w:r>
         <w:rPr>
-          <w:rFonts w:ascii="Microsoft YaHei" w:hAnsi="Microsoft YaHei" w:eastAsia="Microsoft YaHei"/>
-          <w:b w:val="0"/>
+          <w:rFonts w:ascii="Microsoft YaHei" w:hAnsi="Microsoft YaHei" w:eastAsia="Microsoft YaHei" w:cs="Microsoft YaHei"/>
           <w:sz w:val="21"/>
+          <w:szCs w:val="22"/>
         </w:rPr>
         <w:t>基于 LLDB 实现 NPU 断点、单步、变量打印及 coredump / 多 Kernel / 多卡调试，端到端打通真机调试流程；社区覆盖 1000+ 开发人员、20+ 活跃算子团队，算子精度与挂死类问题定位由数天缩短至小时级，开发效率提升数倍。</w:t>
       </w:r>
@@ -374,10 +449,10 @@
       </w:pPr>
       <w:r>
         <w:rPr>
-          <w:rFonts w:ascii="Microsoft YaHei" w:hAnsi="Microsoft YaHei" w:eastAsia="Microsoft YaHei"/>
-          <w:b w:val="0"/>
+          <w:rFonts w:ascii="Microsoft YaHei" w:hAnsi="Microsoft YaHei" w:eastAsia="Microsoft YaHei" w:cs="Microsoft YaHei"/>
           <w:color w:val="555555"/>
           <w:sz w:val="19"/>
+          <w:szCs w:val="22"/>
         </w:rPr>
         <w:t>早期参与农机自动驾驶路径规划算法研发（专利 1 项）。</w:t>
       </w:r>
@@ -388,62 +463,45 @@
       </w:pPr>
       <w:r>
         <w:rPr>
-          <w:rFonts w:ascii="Microsoft YaHei" w:hAnsi="Microsoft YaHei" w:eastAsia="Microsoft YaHei"/>
+          <w:rFonts w:ascii="Microsoft YaHei" w:hAnsi="Microsoft YaHei" w:eastAsia="Microsoft YaHei" w:cs="Microsoft YaHei"/>
           <w:b/>
+          <w:bCs/>
           <w:color w:val="003366"/>
           <w:sz w:val="22"/>
+          <w:szCs w:val="22"/>
         </w:rPr>
         <w:t>教育背景</w:t>
       </w:r>
     </w:p>
     <w:p>
+      <w:pPr>
+        <w:spacing w:after="200" w:line="276" w:lineRule="auto"/>
+      </w:pPr>
       <w:r>
         <w:rPr>
-          <w:rFonts w:ascii="Microsoft YaHei" w:hAnsi="Microsoft YaHei" w:eastAsia="Microsoft YaHei"/>
-          <w:b w:val="0"/>
+          <w:rFonts w:ascii="Microsoft YaHei" w:hAnsi="Microsoft YaHei" w:eastAsia="Microsoft YaHei" w:cs="Microsoft YaHei"/>
           <w:sz w:val="21"/>
+          <w:szCs w:val="22"/>
         </w:rPr>
         <w:t>华东师范大学 · 计算机技术 · 硕士 · 2019 — 2022</w:t>
       </w:r>
     </w:p>
     <w:p>
-      <w:r>
-        <w:rPr>
-          <w:rFonts w:ascii="Microsoft YaHei" w:hAnsi="Microsoft YaHei" w:eastAsia="Microsoft YaHei"/>
-          <w:b w:val="0"/>
-          <w:sz w:val="21"/>
-        </w:rPr>
-        <w:t>浙江工业大学 · 计算机科学与技术 · 本科 · 2015 — 2019</w:t>
-      </w:r>
-    </w:p>
-    <w:p>
       <w:pPr>
-        <w:spacing w:before="200" w:after="80"/>
+        <w:spacing w:after="200" w:line="276" w:lineRule="auto"/>
       </w:pPr>
       <w:r>
         <w:rPr>
-          <w:rFonts w:ascii="Microsoft YaHei" w:hAnsi="Microsoft YaHei" w:eastAsia="Microsoft YaHei"/>
-          <w:b/>
-          <w:color w:val="003366"/>
-          <w:sz w:val="22"/>
+          <w:rFonts w:ascii="Microsoft YaHei" w:hAnsi="Microsoft YaHei" w:eastAsia="Microsoft YaHei" w:cs="Microsoft YaHei"/>
+          <w:sz w:val="21"/>
+          <w:szCs w:val="22"/>
         </w:rPr>
-        <w:t>专利</w:t>
-      </w:r>
-    </w:p>
-    <w:p>
-      <w:r>
-        <w:rPr>
-          <w:rFonts w:ascii="Microsoft YaHei" w:hAnsi="Microsoft YaHei" w:eastAsia="Microsoft YaHei"/>
-          <w:b w:val="0"/>
-          <w:sz w:val="21"/>
-        </w:rPr>
-        <w:t>发明专利 1 项（耕地路径规划）</w:t>
+        <w:t>浙江工业大学 · 计算机科学与技术 · 本科 · 2015 — 2019</w:t>
       </w:r>
     </w:p>
     <w:sectPr>
       <w:pgSz w:w="11906" w:h="16838"/>
       <w:pgMar w:top="1020" w:right="1134" w:bottom="1020" w:left="1134" w:header="720" w:footer="720" w:gutter="0"/>
-      <w:cols w:space="720"/>
       <w:docGrid w:linePitch="360"/>
     </w:sectPr>
   </w:body>

</xml_diff>

<commit_message>
add Qwen-Image-Edit, mxfp and modify resume
</commit_message>
<xml_diff>
--- a/resume/cai_shengcheng_resume.docx
+++ b/resume/cai_shengcheng_resume.docx
@@ -56,143 +56,7 @@
           <w:sz w:val="20"/>
           <w:szCs w:val="22"/>
         </w:rPr>
-        <w:t>3 年华为昇腾大模型相关业务研发经验，现就职于昇腾计算开发部推理使能组，组内主要业务为大模型量化、投机推理、测评。本人现任Atlas 950代际大模型量化负责人，主导 MXFP8/MXFP4 与 W4A4 低精度量化算法开发及主流开源模型量化推理落地，支撑 20+ 模型权重在昇腾 950 代际上线与客户送测；精度误差控制在 1% 以内，推理性能达竞品 1.x 倍，单模型适配周期压缩至 1 天。协同 4 部门 20+ 人完成推理引擎、量化算法与工具链端到端交付。</w:t>
-      </w:r>
-    </w:p>
-    <w:p>
-      <w:pPr>
-        <w:spacing w:before="200" w:after="80"/>
-      </w:pPr>
-      <w:r>
-        <w:rPr>
-          <w:rFonts w:ascii="Microsoft YaHei" w:hAnsi="Microsoft YaHei" w:eastAsia="Microsoft YaHei" w:cs="Microsoft YaHei"/>
-          <w:b/>
-          <w:bCs/>
-          <w:color w:val="003366"/>
-          <w:sz w:val="22"/>
-          <w:szCs w:val="22"/>
-        </w:rPr>
-        <w:t>专业技能</w:t>
-      </w:r>
-    </w:p>
-    <w:p>
-      <w:pPr>
-        <w:spacing w:after="40"/>
-      </w:pPr>
-      <w:r>
-        <w:rPr>
-          <w:rFonts w:ascii="Microsoft YaHei" w:hAnsi="Microsoft YaHei" w:eastAsia="Microsoft YaHei" w:cs="Microsoft YaHei"/>
-          <w:b/>
-          <w:bCs/>
-          <w:color w:val="003366"/>
-          <w:sz w:val="20"/>
-          <w:szCs w:val="22"/>
-        </w:rPr>
-        <w:t>编程基础：</w:t>
-      </w:r>
-      <w:r>
-        <w:rPr>
-          <w:rFonts w:ascii="Microsoft YaHei" w:hAnsi="Microsoft YaHei" w:eastAsia="Microsoft YaHei" w:cs="Microsoft YaHei"/>
-          <w:sz w:val="20"/>
-          <w:szCs w:val="22"/>
-        </w:rPr>
-        <w:t>Python，C++，熟悉常用数据结构与面向对象设计</w:t>
-      </w:r>
-    </w:p>
-    <w:p>
-      <w:pPr>
-        <w:spacing w:after="40"/>
-      </w:pPr>
-      <w:r>
-        <w:rPr>
-          <w:rFonts w:ascii="Microsoft YaHei" w:hAnsi="Microsoft YaHei" w:eastAsia="Microsoft YaHei" w:cs="Microsoft YaHei"/>
-          <w:b/>
-          <w:bCs/>
-          <w:color w:val="003366"/>
-          <w:sz w:val="20"/>
-          <w:szCs w:val="22"/>
-        </w:rPr>
-        <w:t>深度学习：</w:t>
-      </w:r>
-      <w:r>
-        <w:rPr>
-          <w:rFonts w:ascii="Microsoft YaHei" w:hAnsi="Microsoft YaHei" w:eastAsia="Microsoft YaHei" w:cs="Microsoft YaHei"/>
-          <w:sz w:val="20"/>
-          <w:szCs w:val="22"/>
-        </w:rPr>
-        <w:t>PyTorch 大模型推理，核心模块 PTQ 量化与性能、精度调优</w:t>
-      </w:r>
-    </w:p>
-    <w:p>
-      <w:pPr>
-        <w:spacing w:after="40"/>
-      </w:pPr>
-      <w:r>
-        <w:rPr>
-          <w:rFonts w:ascii="Microsoft YaHei" w:hAnsi="Microsoft YaHei" w:eastAsia="Microsoft YaHei" w:cs="Microsoft YaHei"/>
-          <w:b/>
-          <w:bCs/>
-          <w:color w:val="003366"/>
-          <w:sz w:val="20"/>
-          <w:szCs w:val="22"/>
-        </w:rPr>
-        <w:t>量化算法：</w:t>
-      </w:r>
-      <w:r>
-        <w:rPr>
-          <w:rFonts w:ascii="Microsoft YaHei" w:hAnsi="Microsoft YaHei" w:eastAsia="Microsoft YaHei" w:cs="Microsoft YaHei"/>
-          <w:sz w:val="20"/>
-          <w:szCs w:val="22"/>
-        </w:rPr>
-        <w:t>MXFP8/MXFP4、SVDQuant、二级量化、MSE Round、W4A4低精量化、Attention量化；熟悉 AWQ/GPTQ/SmoothQuant/autoround 等业界主流PTQ量化算法</w:t>
-      </w:r>
-    </w:p>
-    <w:p>
-      <w:pPr>
-        <w:spacing w:after="40"/>
-      </w:pPr>
-      <w:r>
-        <w:rPr>
-          <w:rFonts w:ascii="Microsoft YaHei" w:hAnsi="Microsoft YaHei" w:eastAsia="Microsoft YaHei" w:cs="Microsoft YaHei"/>
-          <w:b/>
-          <w:bCs/>
-          <w:color w:val="003366"/>
-          <w:sz w:val="20"/>
-          <w:szCs w:val="22"/>
-        </w:rPr>
-        <w:t>推理优化：</w:t>
-      </w:r>
-      <w:r>
-        <w:rPr>
-          <w:rFonts w:ascii="Microsoft YaHei" w:hAnsi="Microsoft YaHei" w:eastAsia="Microsoft YaHei" w:cs="Microsoft YaHei"/>
-          <w:sz w:val="20"/>
-          <w:szCs w:val="22"/>
-        </w:rPr>
-        <w:t>量化算子实现、Model-free 权重转换、推理引擎协同优化、0-day 模型适配</w:t>
-      </w:r>
-    </w:p>
-    <w:p>
-      <w:pPr>
-        <w:spacing w:after="40"/>
-      </w:pPr>
-      <w:r>
-        <w:rPr>
-          <w:rFonts w:ascii="Microsoft YaHei" w:hAnsi="Microsoft YaHei" w:eastAsia="Microsoft YaHei" w:cs="Microsoft YaHei"/>
-          <w:b/>
-          <w:bCs/>
-          <w:color w:val="003366"/>
-          <w:sz w:val="20"/>
-          <w:szCs w:val="22"/>
-        </w:rPr>
-        <w:t>算子开发：</w:t>
-      </w:r>
-      <w:r>
-        <w:rPr>
-          <w:rFonts w:ascii="Microsoft YaHei" w:hAnsi="Microsoft YaHei" w:eastAsia="Microsoft YaHei" w:cs="Microsoft YaHei"/>
-          <w:sz w:val="20"/>
-          <w:szCs w:val="22"/>
-        </w:rPr>
-        <w:t>Ascend C 算子开发与上板调试（NPU Debugger）</w:t>
+        <w:t>3 年华为昇腾大模型相关业务研发经验，现就职于昇腾计算开发部推理使能组，组内主要业务为大模型量化、投机推理、测评。本人现任Atlas 950代际大模型量化负责人，主导浮点量化算法和低精度量化算法开发及主流开源模型量化推理落地，支撑 20+ 模型权重在昇腾 950 代际上线与客户送测；精度误差控制在 1% 以内，推理性能达竞品 1.x 倍，单模型适配周期压缩至 1 天。协同 4 部门 20+ 人完成推理引擎、量化算法与工具链端到端交付。</w:t>
       </w:r>
     </w:p>
     <w:p>
@@ -455,6 +319,155 @@
           <w:szCs w:val="22"/>
         </w:rPr>
         <w:t>早期参与农机自动驾驶路径规划算法研发（专利 1 项）。</w:t>
+      </w:r>
+      <w:r>
+        <w:t xml:space="preserve">  </w:t>
+      </w:r>
+    </w:p>
+    <w:p>
+      <w:pPr>
+        <w:spacing w:before="200" w:after="80" w:line="276" w:lineRule="auto"/>
+      </w:pPr>
+      <w:r>
+        <w:rPr>
+          <w:rFonts w:ascii="Microsoft YaHei" w:cs="Microsoft YaHei"/>
+          <w:b/>
+          <w:bCs/>
+          <w:sz w:val="22"/>
+          <w:szCs w:val="22"/>
+        </w:rPr>
+        <w:t>专业技能</w:t>
+      </w:r>
+    </w:p>
+    <w:p>
+      <w:pPr>
+        <w:spacing w:after="40" w:line="276" w:lineRule="auto"/>
+      </w:pPr>
+      <w:r>
+        <w:rPr>
+          <w:rFonts w:ascii="Microsoft YaHei" w:cs="Microsoft YaHei"/>
+          <w:b/>
+          <w:bCs/>
+          <w:sz w:val="20"/>
+          <w:szCs w:val="20"/>
+        </w:rPr>
+        <w:t>编程基础：</w:t>
+      </w:r>
+      <w:r>
+        <w:rPr>
+          <w:rFonts w:ascii="Microsoft YaHei" w:cs="Microsoft YaHei"/>
+          <w:sz w:val="20"/>
+          <w:szCs w:val="20"/>
+        </w:rPr>
+        <w:t>Python，C++，熟悉常用数据结构与面向对象设计</w:t>
+      </w:r>
+    </w:p>
+    <w:p>
+      <w:pPr>
+        <w:spacing w:after="40" w:line="276" w:lineRule="auto"/>
+      </w:pPr>
+      <w:r>
+        <w:rPr>
+          <w:rFonts w:ascii="Microsoft YaHei" w:cs="Microsoft YaHei"/>
+          <w:b/>
+          <w:bCs/>
+          <w:sz w:val="20"/>
+          <w:szCs w:val="20"/>
+        </w:rPr>
+        <w:t>深度学习：</w:t>
+      </w:r>
+      <w:r>
+        <w:rPr>
+          <w:rFonts w:ascii="Microsoft YaHei" w:cs="Microsoft YaHei"/>
+          <w:sz w:val="20"/>
+          <w:szCs w:val="20"/>
+        </w:rPr>
+        <w:t>PyTorch 大模型推理，核心模块 PTQ 量化与性能、精度调优</w:t>
+      </w:r>
+    </w:p>
+    <w:p>
+      <w:pPr>
+        <w:spacing w:after="40" w:line="276" w:lineRule="auto"/>
+      </w:pPr>
+      <w:r>
+        <w:rPr>
+          <w:rFonts w:ascii="Microsoft YaHei" w:cs="Microsoft YaHei"/>
+          <w:b/>
+          <w:bCs/>
+          <w:sz w:val="20"/>
+          <w:szCs w:val="20"/>
+        </w:rPr>
+        <w:t>推理优化：</w:t>
+      </w:r>
+      <w:r>
+        <w:rPr>
+          <w:rFonts w:ascii="Microsoft YaHei" w:cs="Microsoft YaHei"/>
+          <w:sz w:val="20"/>
+          <w:szCs w:val="20"/>
+        </w:rPr>
+        <w:t>模型量化、Model-free 权重转换、推理引擎（vllm等）协同</w:t>
+      </w:r>
+    </w:p>
+    <w:p>
+      <w:pPr>
+        <w:spacing w:after="40" w:line="276" w:lineRule="auto"/>
+      </w:pPr>
+      <w:r>
+        <w:rPr>
+          <w:rFonts w:ascii="Microsoft YaHei" w:cs="Microsoft YaHei"/>
+          <w:b/>
+          <w:bCs/>
+          <w:sz w:val="20"/>
+          <w:szCs w:val="20"/>
+        </w:rPr>
+        <w:t>算子开发：</w:t>
+      </w:r>
+      <w:r>
+        <w:rPr>
+          <w:rFonts w:ascii="Microsoft YaHei" w:cs="Microsoft YaHei"/>
+          <w:sz w:val="20"/>
+          <w:szCs w:val="20"/>
+        </w:rPr>
+        <w:t>Ascend C 算子开发与上板调试（NPU Debugger）</w:t>
+      </w:r>
+      <w:r>
+        <w:t xml:space="preserve"> </w:t>
+      </w:r>
+      <w:r>
+        <w:rPr>
+          <w:rFonts w:ascii="Microsoft YaHei" w:cs="Microsoft YaHei"/>
+          <w:sz w:val="20"/>
+          <w:szCs w:val="20"/>
+        </w:rPr>
+        <w:t>、量化算子实现</w:t>
+      </w:r>
+    </w:p>
+    <w:p>
+      <w:pPr>
+        <w:spacing w:after="40" w:line="276" w:lineRule="auto"/>
+      </w:pPr>
+      <w:r>
+        <w:rPr>
+          <w:rFonts w:ascii="Microsoft YaHei" w:hAnsi="Microsoft YaHei" w:cs="Microsoft YaHei"/>
+          <w:b/>
+          <w:bCs/>
+          <w:sz w:val="20"/>
+          <w:szCs w:val="20"/>
+        </w:rPr>
+        <w:t>开发技能：</w:t>
+      </w:r>
+      <w:r>
+        <w:rPr>
+          <w:rFonts w:ascii="Microsoft YaHei" w:hAnsi="Microsoft YaHei" w:cs="Microsoft YaHei"/>
+          <w:sz w:val="20"/>
+          <w:szCs w:val="20"/>
+        </w:rPr>
+        <w:t>熟练使用agent开发，参与基于NPU的大模型量化agent工具（模型适配、量化调优、推理测评）</w:t>
+      </w:r>
+    </w:p>
+    <w:p>
+      <w:r>
+        <w:t xml:space="preserve">    </w:t>
       </w:r>
     </w:p>
     <w:p>

</xml_diff>

<commit_message>
add deepseek, qwen quant and modify resume
</commit_message>
<xml_diff>
--- a/resume/cai_shengcheng_resume.docx
+++ b/resume/cai_shengcheng_resume.docx
@@ -1,19 +1,14 @@
 
 <file path=word/document.xml><?xml version="1.0" encoding="utf-8"?>
-<w:document xmlns:wpc="http://schemas.microsoft.com/office/word/2010/wordprocessingCanvas" xmlns:mc="http://schemas.openxmlformats.org/markup-compatibility/2006" xmlns:o="urn:schemas-microsoft-com:office:office" xmlns:r="http://schemas.openxmlformats.org/officeDocument/2006/relationships" xmlns:m="http://schemas.openxmlformats.org/officeDocument/2006/math" xmlns:v="urn:schemas-microsoft-com:vml" xmlns:wp14="http://schemas.microsoft.com/office/word/2010/wordprocessingDrawing" xmlns:wp="http://schemas.openxmlformats.org/drawingml/2006/wordprocessingDrawing" xmlns:w10="urn:schemas-microsoft-com:office:word" xmlns:w="http://schemas.openxmlformats.org/wordprocessingml/2006/main" xmlns:w14="http://schemas.microsoft.com/office/word/2010/wordml" xmlns:w15="http://schemas.microsoft.com/office/word/2012/wordml" xmlns:w16se="http://schemas.microsoft.com/office/word/2015/wordml/symex" xmlns:w16cid="http://schemas.microsoft.com/office/word/2016/wordml/cid" xmlns:w16="http://schemas.microsoft.com/office/word/2018/wordml" xmlns:w16cex="http://schemas.microsoft.com/office/word/2018/wordml/cex" xmlns:w16sdtdh="http://schemas.microsoft.com/office/word/2020/wordml/sdtdatahash" xmlns:wne="http://schemas.microsoft.com/office/word/2006/wordml" xmlns:wpg="http://schemas.microsoft.com/office/word/2010/wordprocessingGroup" xmlns:wps="http://schemas.microsoft.com/office/word/2010/wordprocessingShape" mc:Ignorable="w14 w15 w16se w16cid w16 w16cex w16sdtdh wp14">
+<w:document xmlns:wpc="http://schemas.microsoft.com/office/word/2010/wordprocessingCanvas" xmlns:mo="http://schemas.microsoft.com/office/mac/office/2008/main" xmlns:mc="http://schemas.openxmlformats.org/markup-compatibility/2006" xmlns:mv="urn:schemas-microsoft-com:mac:vml" xmlns:o="urn:schemas-microsoft-com:office:office" xmlns:r="http://schemas.openxmlformats.org/officeDocument/2006/relationships" xmlns:m="http://schemas.openxmlformats.org/officeDocument/2006/math" xmlns:v="urn:schemas-microsoft-com:vml" xmlns:wp14="http://schemas.microsoft.com/office/word/2010/wordprocessingDrawing" xmlns:wp="http://schemas.openxmlformats.org/drawingml/2006/wordprocessingDrawing" xmlns:w10="urn:schemas-microsoft-com:office:word" xmlns:w="http://schemas.openxmlformats.org/wordprocessingml/2006/main" xmlns:w14="http://schemas.microsoft.com/office/word/2010/wordml" xmlns:wpg="http://schemas.microsoft.com/office/word/2010/wordprocessingGroup" xmlns:wpi="http://schemas.microsoft.com/office/word/2010/wordprocessingInk" xmlns:wne="http://schemas.microsoft.com/office/word/2006/wordml" xmlns:wps="http://schemas.microsoft.com/office/word/2010/wordprocessingShape" mc:Ignorable="w14 wp14">
   <w:body>
     <w:p>
-      <w:pPr>
-        <w:spacing w:after="200" w:line="276" w:lineRule="auto"/>
-      </w:pPr>
       <w:r>
         <w:rPr>
-          <w:rFonts w:ascii="Microsoft YaHei" w:hAnsi="Microsoft YaHei" w:eastAsia="Microsoft YaHei" w:cs="Microsoft YaHei"/>
+          <w:rFonts w:ascii="Microsoft YaHei" w:hAnsi="Microsoft YaHei" w:eastAsia="Microsoft YaHei"/>
           <w:b/>
-          <w:bCs/>
           <w:color w:val="003366"/>
           <w:sz w:val="40"/>
-          <w:szCs w:val="22"/>
         </w:rPr>
         <w:t>蔡圣诚</w:t>
       </w:r>
@@ -24,10 +19,10 @@
       </w:pPr>
       <w:r>
         <w:rPr>
-          <w:rFonts w:ascii="Microsoft YaHei" w:hAnsi="Microsoft YaHei" w:eastAsia="Microsoft YaHei" w:cs="Microsoft YaHei"/>
+          <w:rFonts w:ascii="Microsoft YaHei" w:hAnsi="Microsoft YaHei" w:eastAsia="Microsoft YaHei"/>
+          <w:b w:val="0"/>
           <w:color w:val="666666"/>
           <w:sz w:val="19"/>
-          <w:szCs w:val="22"/>
         </w:rPr>
         <w:t>求职方向：大模型推理工程师（量化推理 / 推理性能优化）</w:t>
       </w:r>
@@ -38,10 +33,10 @@
       </w:pPr>
       <w:r>
         <w:rPr>
-          <w:rFonts w:ascii="Microsoft YaHei" w:hAnsi="Microsoft YaHei" w:eastAsia="Microsoft YaHei" w:cs="Microsoft YaHei"/>
+          <w:rFonts w:ascii="Microsoft YaHei" w:hAnsi="Microsoft YaHei" w:eastAsia="Microsoft YaHei"/>
+          <w:b w:val="0"/>
           <w:color w:val="666666"/>
           <w:sz w:val="19"/>
-          <w:szCs w:val="22"/>
         </w:rPr>
         <w:t>杭州（可接受上海） | 15958033960 | cscznb5612@gmail.com</w:t>
       </w:r>
@@ -52,9 +47,9 @@
       </w:pPr>
       <w:r>
         <w:rPr>
-          <w:rFonts w:ascii="Microsoft YaHei" w:hAnsi="Microsoft YaHei" w:eastAsia="Microsoft YaHei" w:cs="Microsoft YaHei"/>
+          <w:rFonts w:ascii="Microsoft YaHei" w:hAnsi="Microsoft YaHei" w:eastAsia="Microsoft YaHei"/>
+          <w:b w:val="0"/>
           <w:sz w:val="20"/>
-          <w:szCs w:val="22"/>
         </w:rPr>
         <w:t>3 年华为昇腾大模型相关业务研发经验，现就职于昇腾计算开发部推理使能组，组内主要业务为大模型量化、投机推理、测评。本人现任Atlas 950代际大模型量化负责人，主导浮点量化算法和低精度量化算法开发及主流开源模型量化推理落地，支撑 20+ 模型权重在昇腾 950 代际上线与客户送测；精度误差控制在 1% 以内，推理性能达竞品 1.x 倍，单模型适配周期压缩至 1 天。协同 4 部门 20+ 人完成推理引擎、量化算法与工具链端到端交付。</w:t>
       </w:r>
@@ -65,50 +60,40 @@
       </w:pPr>
       <w:r>
         <w:rPr>
-          <w:rFonts w:ascii="Microsoft YaHei" w:hAnsi="Microsoft YaHei" w:eastAsia="Microsoft YaHei" w:cs="Microsoft YaHei"/>
+          <w:rFonts w:ascii="Microsoft YaHei" w:hAnsi="Microsoft YaHei" w:eastAsia="Microsoft YaHei"/>
           <w:b/>
-          <w:bCs/>
           <w:color w:val="003366"/>
           <w:sz w:val="22"/>
-          <w:szCs w:val="22"/>
         </w:rPr>
         <w:t>工作经历</w:t>
       </w:r>
     </w:p>
     <w:p>
-      <w:pPr>
-        <w:spacing w:after="200" w:line="276" w:lineRule="auto"/>
-      </w:pPr>
       <w:r>
         <w:rPr>
-          <w:rFonts w:ascii="Microsoft YaHei" w:hAnsi="Microsoft YaHei" w:eastAsia="Microsoft YaHei" w:cs="Microsoft YaHei"/>
+          <w:rFonts w:ascii="Microsoft YaHei" w:hAnsi="Microsoft YaHei" w:eastAsia="Microsoft YaHei"/>
           <w:b/>
-          <w:bCs/>
           <w:sz w:val="22"/>
-          <w:szCs w:val="22"/>
         </w:rPr>
         <w:t>华为技术有限公司</w:t>
       </w:r>
       <w:r>
         <w:rPr>
-          <w:rFonts w:ascii="Microsoft YaHei" w:hAnsi="Microsoft YaHei" w:eastAsia="Microsoft YaHei" w:cs="Microsoft YaHei"/>
+          <w:rFonts w:ascii="Microsoft YaHei" w:hAnsi="Microsoft YaHei" w:eastAsia="Microsoft YaHei"/>
+          <w:b w:val="0"/>
           <w:color w:val="666666"/>
           <w:sz w:val="20"/>
-          <w:szCs w:val="22"/>
         </w:rPr>
         <w:t xml:space="preserve">    2022.02 — 至今</w:t>
       </w:r>
     </w:p>
     <w:p>
-      <w:pPr>
-        <w:spacing w:after="200" w:line="276" w:lineRule="auto"/>
-      </w:pPr>
       <w:r>
         <w:rPr>
-          <w:rFonts w:ascii="Microsoft YaHei" w:hAnsi="Microsoft YaHei" w:eastAsia="Microsoft YaHei" w:cs="Microsoft YaHei"/>
+          <w:rFonts w:ascii="Microsoft YaHei" w:hAnsi="Microsoft YaHei" w:eastAsia="Microsoft YaHei"/>
+          <w:b w:val="0"/>
           <w:color w:val="555555"/>
           <w:sz w:val="20"/>
-          <w:szCs w:val="22"/>
         </w:rPr>
         <w:t>高级工程师 · 昇腾大模型推理 / 量化</w:t>
       </w:r>
@@ -119,11 +104,9 @@
       </w:pPr>
       <w:r>
         <w:rPr>
-          <w:rFonts w:ascii="Microsoft YaHei" w:hAnsi="Microsoft YaHei" w:eastAsia="Microsoft YaHei" w:cs="Microsoft YaHei"/>
+          <w:rFonts w:ascii="Microsoft YaHei" w:hAnsi="Microsoft YaHei" w:eastAsia="Microsoft YaHei"/>
           <w:b/>
-          <w:bCs/>
           <w:sz w:val="21"/>
-          <w:szCs w:val="22"/>
         </w:rPr>
         <w:t>大模型量化推理（项目负责人）</w:t>
       </w:r>
@@ -132,24 +115,22 @@
       <w:pPr>
         <w:pStyle w:val="ListBullet"/>
         <w:spacing w:after="60"/>
-        <w:ind w:left="283" w:hanging="360"/>
+        <w:ind w:left="283"/>
       </w:pPr>
       <w:r>
         <w:rPr>
-          <w:rFonts w:ascii="Microsoft YaHei" w:hAnsi="Microsoft YaHei" w:eastAsia="Microsoft YaHei" w:cs="Microsoft YaHei"/>
+          <w:rFonts w:ascii="Microsoft YaHei" w:hAnsi="Microsoft YaHei" w:eastAsia="Microsoft YaHei"/>
           <w:b/>
-          <w:bCs/>
           <w:color w:val="003366"/>
           <w:sz w:val="21"/>
-          <w:szCs w:val="22"/>
         </w:rPr>
         <w:t>MXFP 量化落地：</w:t>
       </w:r>
       <w:r>
         <w:rPr>
-          <w:rFonts w:ascii="Microsoft YaHei" w:hAnsi="Microsoft YaHei" w:eastAsia="Microsoft YaHei" w:cs="Microsoft YaHei"/>
+          <w:rFonts w:ascii="Microsoft YaHei" w:hAnsi="Microsoft YaHei" w:eastAsia="Microsoft YaHei"/>
+          <w:b w:val="0"/>
           <w:sz w:val="21"/>
-          <w:szCs w:val="22"/>
         </w:rPr>
         <w:t>主导 MXFP8、MXFP4 算法设计与实现，支撑 Qwen、DeepSeek、GLM、LongCat、Kimi、Minimax 等 20+ 权重在昇腾 A5 NPU 上线及客户送测；对 DeepSeek v4、Qwen3.5 实现 0-day 量化适配。精度相对浮点误差 &lt;1%，推理性能达竞品 1.x 倍，单模型适配约 1 天，整体调优周级完成。</w:t>
       </w:r>
@@ -158,24 +139,22 @@
       <w:pPr>
         <w:pStyle w:val="ListBullet"/>
         <w:spacing w:after="60"/>
-        <w:ind w:left="283" w:hanging="360"/>
+        <w:ind w:left="283"/>
       </w:pPr>
       <w:r>
         <w:rPr>
-          <w:rFonts w:ascii="Microsoft YaHei" w:hAnsi="Microsoft YaHei" w:eastAsia="Microsoft YaHei" w:cs="Microsoft YaHei"/>
+          <w:rFonts w:ascii="Microsoft YaHei" w:hAnsi="Microsoft YaHei" w:eastAsia="Microsoft YaHei"/>
           <w:b/>
-          <w:bCs/>
           <w:color w:val="003366"/>
           <w:sz w:val="21"/>
-          <w:szCs w:val="22"/>
         </w:rPr>
         <w:t>W4A4 低精度量化：</w:t>
       </w:r>
       <w:r>
         <w:rPr>
-          <w:rFonts w:ascii="Microsoft YaHei" w:hAnsi="Microsoft YaHei" w:eastAsia="Microsoft YaHei" w:cs="Microsoft YaHei"/>
+          <w:rFonts w:ascii="Microsoft YaHei" w:hAnsi="Microsoft YaHei" w:eastAsia="Microsoft YaHei"/>
+          <w:b w:val="0"/>
           <w:sz w:val="21"/>
-          <w:szCs w:val="22"/>
         </w:rPr>
         <w:t>主导 SVDQuant、二级量化、MSE Round、C7 等 4bit 方案，在开源多模态大模型 （Wan2.2、Qwen-Image-Edit等） 上完成 W4A4 量化；VBench or Gedit 精度指标误差均 &lt;0.01，推理性能达竞品 1.x 倍。</w:t>
       </w:r>
@@ -184,24 +163,22 @@
       <w:pPr>
         <w:pStyle w:val="ListBullet"/>
         <w:spacing w:after="60"/>
-        <w:ind w:left="283" w:hanging="360"/>
+        <w:ind w:left="283"/>
       </w:pPr>
       <w:r>
         <w:rPr>
-          <w:rFonts w:ascii="Microsoft YaHei" w:hAnsi="Microsoft YaHei" w:eastAsia="Microsoft YaHei" w:cs="Microsoft YaHei"/>
+          <w:rFonts w:ascii="Microsoft YaHei" w:hAnsi="Microsoft YaHei" w:eastAsia="Microsoft YaHei"/>
           <w:b/>
-          <w:bCs/>
           <w:color w:val="003366"/>
           <w:sz w:val="21"/>
-          <w:szCs w:val="22"/>
         </w:rPr>
         <w:t>动态 PTQ 转换：</w:t>
       </w:r>
       <w:r>
         <w:rPr>
-          <w:rFonts w:ascii="Microsoft YaHei" w:hAnsi="Microsoft YaHei" w:eastAsia="Microsoft YaHei" w:cs="Microsoft YaHei"/>
+          <w:rFonts w:ascii="Microsoft YaHei" w:hAnsi="Microsoft YaHei" w:eastAsia="Microsoft YaHei"/>
+          <w:b w:val="0"/>
           <w:sz w:val="21"/>
-          <w:szCs w:val="22"/>
         </w:rPr>
         <w:t>实现 Model-free 权重转换能力，在 PTQ 动态场景下以轻量化流程完成权重量化，降低大模型迁移与推理部署成本。</w:t>
       </w:r>
@@ -210,24 +187,22 @@
       <w:pPr>
         <w:pStyle w:val="ListBullet"/>
         <w:spacing w:after="60"/>
-        <w:ind w:left="283" w:hanging="360"/>
+        <w:ind w:left="283"/>
       </w:pPr>
       <w:r>
         <w:rPr>
-          <w:rFonts w:ascii="Microsoft YaHei" w:hAnsi="Microsoft YaHei" w:eastAsia="Microsoft YaHei" w:cs="Microsoft YaHei"/>
+          <w:rFonts w:ascii="Microsoft YaHei" w:hAnsi="Microsoft YaHei" w:eastAsia="Microsoft YaHei"/>
           <w:b/>
-          <w:bCs/>
           <w:color w:val="003366"/>
           <w:sz w:val="21"/>
-          <w:szCs w:val="22"/>
         </w:rPr>
         <w:t>端到端项目交付：</w:t>
       </w:r>
       <w:r>
         <w:rPr>
-          <w:rFonts w:ascii="Microsoft YaHei" w:hAnsi="Microsoft YaHei" w:eastAsia="Microsoft YaHei" w:cs="Microsoft YaHei"/>
+          <w:rFonts w:ascii="Microsoft YaHei" w:hAnsi="Microsoft YaHei" w:eastAsia="Microsoft YaHei"/>
+          <w:b w:val="0"/>
           <w:sz w:val="21"/>
-          <w:szCs w:val="22"/>
         </w:rPr>
         <w:t>作为负责人协同推理引擎、量化算法、量化工具 4 个部门 20+ 人推进交付，保障客户面送测通过；相较上一代引入浮点量化体系并扩展 4bit 低精度算法矩阵，参与关键方案设计与路线决策。</w:t>
       </w:r>
@@ -236,34 +211,24 @@
       <w:pPr>
         <w:pStyle w:val="ListBullet"/>
         <w:spacing w:after="60"/>
-        <w:ind w:left="360" w:hanging="360"/>
+        <w:ind w:left="283"/>
       </w:pPr>
       <w:r>
         <w:rPr>
-          <w:rFonts w:ascii="Microsoft YaHei" w:hAnsi="Microsoft YaHei" w:eastAsia="Microsoft YaHei" w:cs="Microsoft YaHei"/>
+          <w:rFonts w:ascii="Microsoft YaHei" w:hAnsi="Microsoft YaHei" w:eastAsia="Microsoft YaHei"/>
           <w:b/>
-          <w:bCs/>
           <w:color w:val="003366"/>
           <w:sz w:val="21"/>
-          <w:szCs w:val="22"/>
         </w:rPr>
         <w:t>投机推理：</w:t>
       </w:r>
       <w:r>
         <w:rPr>
-          <w:rFonts w:ascii="Microsoft YaHei" w:hAnsi="Cambria" w:eastAsia="ＭＳ 明朝" w:cs="Microsoft YaHei" w:hAnsiTheme="minorHAnsi" w:eastAsiaTheme="minorEastAsia"/>
+          <w:rFonts w:ascii="Microsoft YaHei" w:hAnsi="Microsoft YaHei" w:eastAsia="Microsoft YaHei"/>
+          <w:b w:val="0"/>
           <w:sz w:val="21"/>
-          <w:szCs w:val="21"/>
         </w:rPr>
-        <w:t>主要负责DeepSeek v4 flash/pro DSpark 权重的0 day 4bit量化适配。并且</w:t>
-      </w:r>
-      <w:r>
-        <w:rPr>
-          <w:rFonts w:ascii="Microsoft YaHei" w:hAnsi="Microsoft YaHei" w:eastAsia="Microsoft YaHei" w:cs="Microsoft YaHei"/>
-          <w:sz w:val="21"/>
-          <w:szCs w:val="22"/>
-        </w:rPr>
-        <w:t>基于 DeepSeek 开源 DeepSpec，参与完成 910B npu芯片上的 DSpark 训练→GSM8K eval 全链路验证。</w:t>
+        <w:t>主要负责DeepSeek v4 flash/pro DSpark 权重的0 day 4bit量化适配。并且基于 DeepSeek 开源 DeepSpec，参与完成 910B npu芯片上的 DSpark 训练→GSM8K eval 全链路验证。</w:t>
       </w:r>
     </w:p>
     <w:p>
@@ -272,11 +237,9 @@
       </w:pPr>
       <w:r>
         <w:rPr>
-          <w:rFonts w:ascii="Microsoft YaHei" w:hAnsi="Microsoft YaHei" w:eastAsia="Microsoft YaHei" w:cs="Microsoft YaHei"/>
+          <w:rFonts w:ascii="Microsoft YaHei" w:hAnsi="Microsoft YaHei" w:eastAsia="Microsoft YaHei"/>
           <w:b/>
-          <w:bCs/>
           <w:sz w:val="21"/>
-          <w:szCs w:val="22"/>
         </w:rPr>
         <w:t>昇腾算子调试工具</w:t>
       </w:r>
@@ -285,24 +248,22 @@
       <w:pPr>
         <w:pStyle w:val="ListBullet"/>
         <w:spacing w:after="60"/>
-        <w:ind w:left="283" w:hanging="360"/>
+        <w:ind w:left="283"/>
       </w:pPr>
       <w:r>
         <w:rPr>
-          <w:rFonts w:ascii="Microsoft YaHei" w:hAnsi="Microsoft YaHei" w:eastAsia="Microsoft YaHei" w:cs="Microsoft YaHei"/>
+          <w:rFonts w:ascii="Microsoft YaHei" w:hAnsi="Microsoft YaHei" w:eastAsia="Microsoft YaHei"/>
           <w:b/>
-          <w:bCs/>
           <w:color w:val="003366"/>
           <w:sz w:val="21"/>
-          <w:szCs w:val="22"/>
         </w:rPr>
         <w:t>上板调试与生态：</w:t>
       </w:r>
       <w:r>
         <w:rPr>
-          <w:rFonts w:ascii="Microsoft YaHei" w:hAnsi="Microsoft YaHei" w:eastAsia="Microsoft YaHei" w:cs="Microsoft YaHei"/>
+          <w:rFonts w:ascii="Microsoft YaHei" w:hAnsi="Microsoft YaHei" w:eastAsia="Microsoft YaHei"/>
+          <w:b w:val="0"/>
           <w:sz w:val="21"/>
-          <w:szCs w:val="22"/>
         </w:rPr>
         <w:t>基于 LLDB 实现 NPU 断点、单步、变量打印及 coredump / 多 Kernel / 多卡调试，端到端打通真机调试流程；社区覆盖 1000+ 开发人员、20+ 活跃算子团队，算子精度与挂死类问题定位由数天缩短至小时级，开发效率提升数倍。</w:t>
       </w:r>
@@ -313,161 +274,12 @@
       </w:pPr>
       <w:r>
         <w:rPr>
-          <w:rFonts w:ascii="Microsoft YaHei" w:hAnsi="Microsoft YaHei" w:eastAsia="Microsoft YaHei" w:cs="Microsoft YaHei"/>
+          <w:rFonts w:ascii="Microsoft YaHei" w:hAnsi="Microsoft YaHei" w:eastAsia="Microsoft YaHei"/>
+          <w:b w:val="0"/>
           <w:color w:val="555555"/>
           <w:sz w:val="19"/>
-          <w:szCs w:val="22"/>
         </w:rPr>
         <w:t>早期参与农机自动驾驶路径规划算法研发（专利 1 项）。</w:t>
-      </w:r>
-      <w:r>
-        <w:t xml:space="preserve">  </w:t>
-      </w:r>
-    </w:p>
-    <w:p>
-      <w:pPr>
-        <w:spacing w:before="200" w:after="80" w:line="276" w:lineRule="auto"/>
-      </w:pPr>
-      <w:r>
-        <w:rPr>
-          <w:rFonts w:ascii="Microsoft YaHei" w:cs="Microsoft YaHei"/>
-          <w:b/>
-          <w:bCs/>
-          <w:sz w:val="22"/>
-          <w:szCs w:val="22"/>
-        </w:rPr>
-        <w:t>专业技能</w:t>
-      </w:r>
-    </w:p>
-    <w:p>
-      <w:pPr>
-        <w:spacing w:after="40" w:line="276" w:lineRule="auto"/>
-      </w:pPr>
-      <w:r>
-        <w:rPr>
-          <w:rFonts w:ascii="Microsoft YaHei" w:cs="Microsoft YaHei"/>
-          <w:b/>
-          <w:bCs/>
-          <w:sz w:val="20"/>
-          <w:szCs w:val="20"/>
-        </w:rPr>
-        <w:t>编程基础：</w:t>
-      </w:r>
-      <w:r>
-        <w:rPr>
-          <w:rFonts w:ascii="Microsoft YaHei" w:cs="Microsoft YaHei"/>
-          <w:sz w:val="20"/>
-          <w:szCs w:val="20"/>
-        </w:rPr>
-        <w:t>Python，C++，熟悉常用数据结构与面向对象设计</w:t>
-      </w:r>
-    </w:p>
-    <w:p>
-      <w:pPr>
-        <w:spacing w:after="40" w:line="276" w:lineRule="auto"/>
-      </w:pPr>
-      <w:r>
-        <w:rPr>
-          <w:rFonts w:ascii="Microsoft YaHei" w:cs="Microsoft YaHei"/>
-          <w:b/>
-          <w:bCs/>
-          <w:sz w:val="20"/>
-          <w:szCs w:val="20"/>
-        </w:rPr>
-        <w:t>深度学习：</w:t>
-      </w:r>
-      <w:r>
-        <w:rPr>
-          <w:rFonts w:ascii="Microsoft YaHei" w:cs="Microsoft YaHei"/>
-          <w:sz w:val="20"/>
-          <w:szCs w:val="20"/>
-        </w:rPr>
-        <w:t>PyTorch 大模型推理，核心模块 PTQ 量化与性能、精度调优</w:t>
-      </w:r>
-    </w:p>
-    <w:p>
-      <w:pPr>
-        <w:spacing w:after="40" w:line="276" w:lineRule="auto"/>
-      </w:pPr>
-      <w:r>
-        <w:rPr>
-          <w:rFonts w:ascii="Microsoft YaHei" w:cs="Microsoft YaHei"/>
-          <w:b/>
-          <w:bCs/>
-          <w:sz w:val="20"/>
-          <w:szCs w:val="20"/>
-        </w:rPr>
-        <w:t>推理优化：</w:t>
-      </w:r>
-      <w:r>
-        <w:rPr>
-          <w:rFonts w:ascii="Microsoft YaHei" w:cs="Microsoft YaHei"/>
-          <w:sz w:val="20"/>
-          <w:szCs w:val="20"/>
-        </w:rPr>
-        <w:t>模型量化、Model-free 权重转换、推理引擎（vllm等）协同</w:t>
-      </w:r>
-    </w:p>
-    <w:p>
-      <w:pPr>
-        <w:spacing w:after="40" w:line="276" w:lineRule="auto"/>
-      </w:pPr>
-      <w:r>
-        <w:rPr>
-          <w:rFonts w:ascii="Microsoft YaHei" w:cs="Microsoft YaHei"/>
-          <w:b/>
-          <w:bCs/>
-          <w:sz w:val="20"/>
-          <w:szCs w:val="20"/>
-        </w:rPr>
-        <w:t>算子开发：</w:t>
-      </w:r>
-      <w:r>
-        <w:rPr>
-          <w:rFonts w:ascii="Microsoft YaHei" w:cs="Microsoft YaHei"/>
-          <w:sz w:val="20"/>
-          <w:szCs w:val="20"/>
-        </w:rPr>
-        <w:t>Ascend C 算子开发与上板调试（NPU Debugger）</w:t>
-      </w:r>
-      <w:r>
-        <w:t xml:space="preserve"> </w:t>
-      </w:r>
-      <w:r>
-        <w:rPr>
-          <w:rFonts w:ascii="Microsoft YaHei" w:cs="Microsoft YaHei"/>
-          <w:sz w:val="20"/>
-          <w:szCs w:val="20"/>
-        </w:rPr>
-        <w:t>、量化算子实现</w:t>
-      </w:r>
-    </w:p>
-    <w:p>
-      <w:pPr>
-        <w:spacing w:after="40" w:line="276" w:lineRule="auto"/>
-      </w:pPr>
-      <w:r>
-        <w:rPr>
-          <w:rFonts w:ascii="Microsoft YaHei" w:hAnsi="Microsoft YaHei" w:cs="Microsoft YaHei"/>
-          <w:b/>
-          <w:bCs/>
-          <w:sz w:val="20"/>
-          <w:szCs w:val="20"/>
-        </w:rPr>
-        <w:t>开发技能：</w:t>
-      </w:r>
-      <w:r>
-        <w:rPr>
-          <w:rFonts w:ascii="Microsoft YaHei" w:hAnsi="Microsoft YaHei" w:cs="Microsoft YaHei"/>
-          <w:sz w:val="20"/>
-          <w:szCs w:val="20"/>
-        </w:rPr>
-        <w:t>熟练使用agent开发，参与基于NPU的大模型量化agent工具（模型适配、量化调优、推理测评）</w:t>
-      </w:r>
-    </w:p>
-    <w:p>
-      <w:r>
-        <w:t xml:space="preserve">    </w:t>
       </w:r>
     </w:p>
     <w:p>
@@ -476,38 +288,154 @@
       </w:pPr>
       <w:r>
         <w:rPr>
-          <w:rFonts w:ascii="Microsoft YaHei" w:hAnsi="Microsoft YaHei" w:eastAsia="Microsoft YaHei" w:cs="Microsoft YaHei"/>
+          <w:rFonts w:ascii="Microsoft YaHei" w:hAnsi="Microsoft YaHei" w:eastAsia="Microsoft YaHei"/>
           <w:b/>
-          <w:bCs/>
           <w:color w:val="003366"/>
           <w:sz w:val="22"/>
-          <w:szCs w:val="22"/>
+        </w:rPr>
+        <w:t>专业技能</w:t>
+      </w:r>
+    </w:p>
+    <w:p>
+      <w:pPr>
+        <w:spacing w:after="40"/>
+      </w:pPr>
+      <w:r>
+        <w:rPr>
+          <w:rFonts w:ascii="Microsoft YaHei" w:hAnsi="Microsoft YaHei" w:eastAsia="Microsoft YaHei"/>
+          <w:b/>
+          <w:color w:val="003366"/>
+          <w:sz w:val="20"/>
+        </w:rPr>
+        <w:t>编程基础：</w:t>
+      </w:r>
+      <w:r>
+        <w:rPr>
+          <w:rFonts w:ascii="Microsoft YaHei" w:hAnsi="Microsoft YaHei" w:eastAsia="Microsoft YaHei"/>
+          <w:b w:val="0"/>
+          <w:sz w:val="20"/>
+        </w:rPr>
+        <w:t>Python，C++，熟悉常用数据结构与面向对象设计</w:t>
+      </w:r>
+    </w:p>
+    <w:p>
+      <w:pPr>
+        <w:spacing w:after="40"/>
+      </w:pPr>
+      <w:r>
+        <w:rPr>
+          <w:rFonts w:ascii="Microsoft YaHei" w:hAnsi="Microsoft YaHei" w:eastAsia="Microsoft YaHei"/>
+          <w:b/>
+          <w:color w:val="003366"/>
+          <w:sz w:val="20"/>
+        </w:rPr>
+        <w:t>深度学习：</w:t>
+      </w:r>
+      <w:r>
+        <w:rPr>
+          <w:rFonts w:ascii="Microsoft YaHei" w:hAnsi="Microsoft YaHei" w:eastAsia="Microsoft YaHei"/>
+          <w:b w:val="0"/>
+          <w:sz w:val="20"/>
+        </w:rPr>
+        <w:t>PyTorch 大模型推理，核心模块 PTQ 量化与性能、精度调优</w:t>
+      </w:r>
+    </w:p>
+    <w:p>
+      <w:pPr>
+        <w:spacing w:after="40"/>
+      </w:pPr>
+      <w:r>
+        <w:rPr>
+          <w:rFonts w:ascii="Microsoft YaHei" w:hAnsi="Microsoft YaHei" w:eastAsia="Microsoft YaHei"/>
+          <w:b/>
+          <w:color w:val="003366"/>
+          <w:sz w:val="20"/>
+        </w:rPr>
+        <w:t>推理优化：</w:t>
+      </w:r>
+      <w:r>
+        <w:rPr>
+          <w:rFonts w:ascii="Microsoft YaHei" w:hAnsi="Microsoft YaHei" w:eastAsia="Microsoft YaHei"/>
+          <w:b w:val="0"/>
+          <w:sz w:val="20"/>
+        </w:rPr>
+        <w:t>熟悉多种模型量化算法、离群值抑制、Quarot旋转等，Model-free 权重转换，推理引擎（vllm等）协同</w:t>
+      </w:r>
+    </w:p>
+    <w:p>
+      <w:pPr>
+        <w:spacing w:after="40"/>
+      </w:pPr>
+      <w:r>
+        <w:rPr>
+          <w:rFonts w:ascii="Microsoft YaHei" w:hAnsi="Microsoft YaHei" w:eastAsia="Microsoft YaHei"/>
+          <w:b/>
+          <w:color w:val="003366"/>
+          <w:sz w:val="20"/>
+        </w:rPr>
+        <w:t>算子开发：</w:t>
+      </w:r>
+      <w:r>
+        <w:rPr>
+          <w:rFonts w:ascii="Microsoft YaHei" w:hAnsi="Microsoft YaHei" w:eastAsia="Microsoft YaHei"/>
+          <w:b w:val="0"/>
+          <w:sz w:val="20"/>
+        </w:rPr>
+        <w:t>Ascend C 算子开发与上板调试（NPU Debugger） 、量化算子实现</w:t>
+      </w:r>
+    </w:p>
+    <w:p>
+      <w:pPr>
+        <w:spacing w:after="40"/>
+      </w:pPr>
+      <w:r>
+        <w:rPr>
+          <w:rFonts w:ascii="Microsoft YaHei" w:hAnsi="Microsoft YaHei" w:eastAsia="Microsoft YaHei"/>
+          <w:b/>
+          <w:color w:val="003366"/>
+          <w:sz w:val="20"/>
+        </w:rPr>
+        <w:t>开发技能：</w:t>
+      </w:r>
+      <w:r>
+        <w:rPr>
+          <w:rFonts w:ascii="Microsoft YaHei" w:hAnsi="Microsoft YaHei" w:eastAsia="Microsoft YaHei"/>
+          <w:b w:val="0"/>
+          <w:sz w:val="20"/>
+        </w:rPr>
+        <w:t>熟练使用agent开发，参与基于NPU的大模型量化agent工具（模型适配、量化调优、推理测评）</w:t>
+      </w:r>
+    </w:p>
+    <w:p>
+      <w:pPr>
+        <w:spacing w:before="200" w:after="80"/>
+      </w:pPr>
+      <w:r>
+        <w:rPr>
+          <w:rFonts w:ascii="Microsoft YaHei" w:hAnsi="Microsoft YaHei" w:eastAsia="Microsoft YaHei"/>
+          <w:b/>
+          <w:color w:val="003366"/>
+          <w:sz w:val="22"/>
         </w:rPr>
         <w:t>教育背景</w:t>
       </w:r>
     </w:p>
     <w:p>
-      <w:pPr>
-        <w:spacing w:after="200" w:line="276" w:lineRule="auto"/>
-      </w:pPr>
       <w:r>
         <w:rPr>
-          <w:rFonts w:ascii="Microsoft YaHei" w:hAnsi="Microsoft YaHei" w:eastAsia="Microsoft YaHei" w:cs="Microsoft YaHei"/>
+          <w:rFonts w:ascii="Microsoft YaHei" w:hAnsi="Microsoft YaHei" w:eastAsia="Microsoft YaHei"/>
+          <w:b w:val="0"/>
           <w:sz w:val="21"/>
-          <w:szCs w:val="22"/>
         </w:rPr>
         <w:t>华东师范大学 · 计算机技术 · 硕士 · 2019 — 2022</w:t>
       </w:r>
     </w:p>
     <w:p>
-      <w:pPr>
-        <w:spacing w:after="200" w:line="276" w:lineRule="auto"/>
-      </w:pPr>
       <w:r>
         <w:rPr>
-          <w:rFonts w:ascii="Microsoft YaHei" w:hAnsi="Microsoft YaHei" w:eastAsia="Microsoft YaHei" w:cs="Microsoft YaHei"/>
+          <w:rFonts w:ascii="Microsoft YaHei" w:hAnsi="Microsoft YaHei" w:eastAsia="Microsoft YaHei"/>
+          <w:b w:val="0"/>
           <w:sz w:val="21"/>
-          <w:szCs w:val="22"/>
         </w:rPr>
         <w:t>浙江工业大学 · 计算机科学与技术 · 本科 · 2015 — 2019</w:t>
       </w:r>
@@ -515,6 +443,7 @@
     <w:sectPr>
       <w:pgSz w:w="11906" w:h="16838"/>
       <w:pgMar w:top="1020" w:right="1134" w:bottom="1020" w:left="1134" w:header="720" w:footer="720" w:gutter="0"/>
+      <w:cols w:space="720"/>
       <w:docGrid w:linePitch="360"/>
     </w:sectPr>
   </w:body>

</xml_diff>

<commit_message>
resume and quarot, awq, gptq, autoround
</commit_message>
<xml_diff>
--- a/resume/cai_shengcheng_resume.docx
+++ b/resume/cai_shengcheng_resume.docx
@@ -1,14 +1,19 @@
 
 <file path=word/document.xml><?xml version="1.0" encoding="utf-8"?>
-<w:document xmlns:wpc="http://schemas.microsoft.com/office/word/2010/wordprocessingCanvas" xmlns:mo="http://schemas.microsoft.com/office/mac/office/2008/main" xmlns:mc="http://schemas.openxmlformats.org/markup-compatibility/2006" xmlns:mv="urn:schemas-microsoft-com:mac:vml" xmlns:o="urn:schemas-microsoft-com:office:office" xmlns:r="http://schemas.openxmlformats.org/officeDocument/2006/relationships" xmlns:m="http://schemas.openxmlformats.org/officeDocument/2006/math" xmlns:v="urn:schemas-microsoft-com:vml" xmlns:wp14="http://schemas.microsoft.com/office/word/2010/wordprocessingDrawing" xmlns:wp="http://schemas.openxmlformats.org/drawingml/2006/wordprocessingDrawing" xmlns:w10="urn:schemas-microsoft-com:office:word" xmlns:w="http://schemas.openxmlformats.org/wordprocessingml/2006/main" xmlns:w14="http://schemas.microsoft.com/office/word/2010/wordml" xmlns:wpg="http://schemas.microsoft.com/office/word/2010/wordprocessingGroup" xmlns:wpi="http://schemas.microsoft.com/office/word/2010/wordprocessingInk" xmlns:wne="http://schemas.microsoft.com/office/word/2006/wordml" xmlns:wps="http://schemas.microsoft.com/office/word/2010/wordprocessingShape" mc:Ignorable="w14 wp14">
+<w:document xmlns:wpc="http://schemas.microsoft.com/office/word/2010/wordprocessingCanvas" xmlns:mc="http://schemas.openxmlformats.org/markup-compatibility/2006" xmlns:o="urn:schemas-microsoft-com:office:office" xmlns:r="http://schemas.openxmlformats.org/officeDocument/2006/relationships" xmlns:m="http://schemas.openxmlformats.org/officeDocument/2006/math" xmlns:v="urn:schemas-microsoft-com:vml" xmlns:wp14="http://schemas.microsoft.com/office/word/2010/wordprocessingDrawing" xmlns:wp="http://schemas.openxmlformats.org/drawingml/2006/wordprocessingDrawing" xmlns:w10="urn:schemas-microsoft-com:office:word" xmlns:w="http://schemas.openxmlformats.org/wordprocessingml/2006/main" xmlns:w14="http://schemas.microsoft.com/office/word/2010/wordml" xmlns:w15="http://schemas.microsoft.com/office/word/2012/wordml" xmlns:w16se="http://schemas.microsoft.com/office/word/2015/wordml/symex" xmlns:w16cid="http://schemas.microsoft.com/office/word/2016/wordml/cid" xmlns:w16="http://schemas.microsoft.com/office/word/2018/wordml" xmlns:w16cex="http://schemas.microsoft.com/office/word/2018/wordml/cex" xmlns:w16sdtdh="http://schemas.microsoft.com/office/word/2020/wordml/sdtdatahash" xmlns:wne="http://schemas.microsoft.com/office/word/2006/wordml" xmlns:wpg="http://schemas.microsoft.com/office/word/2010/wordprocessingGroup" xmlns:wps="http://schemas.microsoft.com/office/word/2010/wordprocessingShape" mc:Ignorable="w14 w15 w16se w16cid w16 w16cex w16sdtdh wp14">
   <w:body>
     <w:p>
+      <w:pPr>
+        <w:spacing w:after="200" w:line="276" w:lineRule="auto"/>
+      </w:pPr>
       <w:r>
         <w:rPr>
-          <w:rFonts w:ascii="Microsoft YaHei" w:hAnsi="Microsoft YaHei" w:eastAsia="Microsoft YaHei"/>
+          <w:rFonts w:ascii="Microsoft YaHei" w:hAnsi="Microsoft YaHei" w:eastAsia="Microsoft YaHei" w:cs="Microsoft YaHei" w:csTheme="minorBidi"/>
           <w:b/>
+          <w:bCs/>
           <w:color w:val="003366"/>
           <w:sz w:val="40"/>
+          <w:szCs w:val="22"/>
         </w:rPr>
         <w:t>蔡圣诚</w:t>
       </w:r>
@@ -19,10 +24,10 @@
       </w:pPr>
       <w:r>
         <w:rPr>
-          <w:rFonts w:ascii="Microsoft YaHei" w:hAnsi="Microsoft YaHei" w:eastAsia="Microsoft YaHei"/>
-          <w:b w:val="0"/>
+          <w:rFonts w:ascii="Microsoft YaHei" w:hAnsi="Microsoft YaHei" w:eastAsia="Microsoft YaHei" w:cs="Microsoft YaHei" w:csTheme="minorBidi"/>
           <w:color w:val="666666"/>
           <w:sz w:val="19"/>
+          <w:szCs w:val="22"/>
         </w:rPr>
         <w:t>求职方向：大模型推理工程师（量化推理 / 推理性能优化）</w:t>
       </w:r>
@@ -33,10 +38,10 @@
       </w:pPr>
       <w:r>
         <w:rPr>
-          <w:rFonts w:ascii="Microsoft YaHei" w:hAnsi="Microsoft YaHei" w:eastAsia="Microsoft YaHei"/>
-          <w:b w:val="0"/>
+          <w:rFonts w:ascii="Microsoft YaHei" w:hAnsi="Microsoft YaHei" w:eastAsia="Microsoft YaHei" w:cs="Microsoft YaHei" w:csTheme="minorBidi"/>
           <w:color w:val="666666"/>
           <w:sz w:val="19"/>
+          <w:szCs w:val="22"/>
         </w:rPr>
         <w:t>杭州（可接受上海） | 15958033960 | cscznb5612@gmail.com</w:t>
       </w:r>
@@ -47,11 +52,83 @@
       </w:pPr>
       <w:r>
         <w:rPr>
-          <w:rFonts w:ascii="Microsoft YaHei" w:hAnsi="Microsoft YaHei" w:eastAsia="Microsoft YaHei"/>
-          <w:b w:val="0"/>
+          <w:rFonts w:ascii="Microsoft YaHei" w:hAnsi="Microsoft YaHei" w:eastAsia="Microsoft YaHei" w:cs="Microsoft YaHei" w:csTheme="minorBidi"/>
           <w:sz w:val="20"/>
+          <w:szCs w:val="22"/>
         </w:rPr>
-        <w:t>3 年华为昇腾大模型相关业务研发经验，现就职于昇腾计算开发部推理使能组，组内主要业务为大模型量化、投机推理、测评。本人现任Atlas 950代际大模型量化负责人，主导浮点量化算法和低精度量化算法开发及主流开源模型量化推理落地，支撑 20+ 模型权重在昇腾 950 代际上线与客户送测；精度误差控制在 1% 以内，推理性能达竞品 1.x 倍，单模型适配周期压缩至 1 天。协同 4 部门 20+ 人完成推理引擎、量化算法与工具链端到端交付。</w:t>
+        <w:t>3 年+华为昇腾大模型相关业务研发经验，现就职于昇腾计算开发部</w:t>
+      </w:r>
+      <w:r>
+        <w:rPr>
+          <w:rFonts w:ascii="Microsoft YaHei" w:hAnsi="Microsoft YaHei" w:eastAsia="Microsoft YaHei" w:cs="Microsoft YaHei" w:csTheme="minorBidi"/>
+          <w:b/>
+          <w:bCs/>
+          <w:sz w:val="20"/>
+          <w:szCs w:val="22"/>
+        </w:rPr>
+        <w:t>推理使能</w:t>
+      </w:r>
+      <w:r>
+        <w:rPr>
+          <w:rFonts w:ascii="Microsoft YaHei" w:hAnsi="Microsoft YaHei" w:eastAsia="Microsoft YaHei" w:cs="Microsoft YaHei" w:csTheme="minorBidi"/>
+          <w:sz w:val="20"/>
+          <w:szCs w:val="22"/>
+        </w:rPr>
+        <w:t>组，组内主要业务为</w:t>
+      </w:r>
+      <w:r>
+        <w:rPr>
+          <w:rFonts w:ascii="Microsoft YaHei" w:hAnsi="Microsoft YaHei" w:eastAsia="Microsoft YaHei" w:cs="Microsoft YaHei" w:csTheme="minorBidi"/>
+          <w:b/>
+          <w:bCs/>
+          <w:sz w:val="20"/>
+          <w:szCs w:val="22"/>
+        </w:rPr>
+        <w:t>大模型量化、投机推理、测评</w:t>
+      </w:r>
+      <w:r>
+        <w:rPr>
+          <w:rFonts w:ascii="Microsoft YaHei" w:hAnsi="Microsoft YaHei" w:eastAsia="Microsoft YaHei" w:cs="Microsoft YaHei" w:csTheme="minorBidi"/>
+          <w:sz w:val="20"/>
+          <w:szCs w:val="22"/>
+        </w:rPr>
+        <w:t>。本人现任Atlas 950代际大模型量化负责人，主导</w:t>
+      </w:r>
+      <w:r>
+        <w:rPr>
+          <w:rFonts w:ascii="Microsoft YaHei" w:hAnsi="Microsoft YaHei" w:eastAsia="Microsoft YaHei" w:cs="Microsoft YaHei" w:csTheme="minorBidi"/>
+          <w:b/>
+          <w:bCs/>
+          <w:sz w:val="20"/>
+          <w:szCs w:val="22"/>
+        </w:rPr>
+        <w:t>浮点量化算法</w:t>
+      </w:r>
+      <w:r>
+        <w:rPr>
+          <w:rFonts w:ascii="Microsoft YaHei" w:hAnsi="Microsoft YaHei" w:eastAsia="Microsoft YaHei" w:cs="Microsoft YaHei" w:csTheme="minorBidi"/>
+          <w:sz w:val="20"/>
+          <w:szCs w:val="22"/>
+        </w:rPr>
+        <w:t>和</w:t>
+      </w:r>
+      <w:r>
+        <w:rPr>
+          <w:rFonts w:ascii="Microsoft YaHei" w:hAnsi="Microsoft YaHei" w:eastAsia="Microsoft YaHei" w:cs="Microsoft YaHei" w:csTheme="minorBidi"/>
+          <w:b/>
+          <w:bCs/>
+          <w:sz w:val="20"/>
+          <w:szCs w:val="22"/>
+        </w:rPr>
+        <w:t>低精度量化算法</w:t>
+      </w:r>
+      <w:r>
+        <w:rPr>
+          <w:rFonts w:ascii="Microsoft YaHei" w:hAnsi="Microsoft YaHei" w:eastAsia="Microsoft YaHei" w:cs="Microsoft YaHei" w:csTheme="minorBidi"/>
+          <w:sz w:val="20"/>
+          <w:szCs w:val="22"/>
+        </w:rPr>
+        <w:t>开发及主流开源模型量化推理落地，支撑 20+ 模型权重在昇腾 950 代际上线与客户送测；精度误差控制在 1% 以内，推理性能达竞品 1.x 倍，单模型适配周期压缩至 1 天。协同 4 部门 20+ 人完成推理引擎、量化算法与工具链端到端交付。</w:t>
       </w:r>
     </w:p>
     <w:p>
@@ -60,40 +137,50 @@
       </w:pPr>
       <w:r>
         <w:rPr>
-          <w:rFonts w:ascii="Microsoft YaHei" w:hAnsi="Microsoft YaHei" w:eastAsia="Microsoft YaHei"/>
+          <w:rFonts w:ascii="Microsoft YaHei" w:hAnsi="Microsoft YaHei" w:eastAsia="Microsoft YaHei" w:cs="Microsoft YaHei" w:csTheme="minorBidi"/>
           <w:b/>
+          <w:bCs/>
           <w:color w:val="003366"/>
           <w:sz w:val="22"/>
+          <w:szCs w:val="22"/>
         </w:rPr>
         <w:t>工作经历</w:t>
       </w:r>
     </w:p>
     <w:p>
+      <w:pPr>
+        <w:spacing w:after="200" w:line="276" w:lineRule="auto"/>
+      </w:pPr>
       <w:r>
         <w:rPr>
-          <w:rFonts w:ascii="Microsoft YaHei" w:hAnsi="Microsoft YaHei" w:eastAsia="Microsoft YaHei"/>
+          <w:rFonts w:ascii="Microsoft YaHei" w:hAnsi="Microsoft YaHei" w:eastAsia="Microsoft YaHei" w:cs="Microsoft YaHei" w:csTheme="minorBidi"/>
           <w:b/>
+          <w:bCs/>
           <w:sz w:val="22"/>
+          <w:szCs w:val="22"/>
         </w:rPr>
         <w:t>华为技术有限公司</w:t>
       </w:r>
       <w:r>
         <w:rPr>
-          <w:rFonts w:ascii="Microsoft YaHei" w:hAnsi="Microsoft YaHei" w:eastAsia="Microsoft YaHei"/>
-          <w:b w:val="0"/>
+          <w:rFonts w:ascii="Microsoft YaHei" w:hAnsi="Microsoft YaHei" w:eastAsia="Microsoft YaHei" w:cs="Microsoft YaHei" w:csTheme="minorBidi"/>
           <w:color w:val="666666"/>
           <w:sz w:val="20"/>
+          <w:szCs w:val="22"/>
         </w:rPr>
         <w:t xml:space="preserve">    2022.02 — 至今</w:t>
       </w:r>
     </w:p>
     <w:p>
+      <w:pPr>
+        <w:spacing w:after="200" w:line="276" w:lineRule="auto"/>
+      </w:pPr>
       <w:r>
         <w:rPr>
-          <w:rFonts w:ascii="Microsoft YaHei" w:hAnsi="Microsoft YaHei" w:eastAsia="Microsoft YaHei"/>
-          <w:b w:val="0"/>
+          <w:rFonts w:ascii="Microsoft YaHei" w:hAnsi="Microsoft YaHei" w:eastAsia="Microsoft YaHei" w:cs="Microsoft YaHei" w:csTheme="minorBidi"/>
           <w:color w:val="555555"/>
           <w:sz w:val="20"/>
+          <w:szCs w:val="22"/>
         </w:rPr>
         <w:t>高级工程师 · 昇腾大模型推理 / 量化</w:t>
       </w:r>
@@ -104,9 +191,11 @@
       </w:pPr>
       <w:r>
         <w:rPr>
-          <w:rFonts w:ascii="Microsoft YaHei" w:hAnsi="Microsoft YaHei" w:eastAsia="Microsoft YaHei"/>
+          <w:rFonts w:ascii="Microsoft YaHei" w:hAnsi="Microsoft YaHei" w:eastAsia="Microsoft YaHei" w:cs="Microsoft YaHei" w:csTheme="minorBidi"/>
           <w:b/>
+          <w:bCs/>
           <w:sz w:val="21"/>
+          <w:szCs w:val="22"/>
         </w:rPr>
         <w:t>大模型量化推理（项目负责人）</w:t>
       </w:r>
@@ -115,94 +204,156 @@
       <w:pPr>
         <w:pStyle w:val="ListBullet"/>
         <w:spacing w:after="60"/>
-        <w:ind w:left="283"/>
+        <w:ind w:left="283" w:hanging="360"/>
       </w:pPr>
       <w:r>
         <w:rPr>
-          <w:rFonts w:ascii="Microsoft YaHei" w:hAnsi="Microsoft YaHei" w:eastAsia="Microsoft YaHei"/>
+          <w:rFonts w:ascii="Microsoft YaHei" w:hAnsi="Microsoft YaHei" w:eastAsia="Microsoft YaHei" w:cs="Microsoft YaHei" w:csTheme="minorBidi"/>
           <w:b/>
+          <w:bCs/>
           <w:color w:val="003366"/>
           <w:sz w:val="21"/>
+          <w:szCs w:val="22"/>
         </w:rPr>
         <w:t>MXFP 量化落地：</w:t>
       </w:r>
       <w:r>
         <w:rPr>
-          <w:rFonts w:ascii="Microsoft YaHei" w:hAnsi="Microsoft YaHei" w:eastAsia="Microsoft YaHei"/>
-          <w:b w:val="0"/>
+          <w:rFonts w:ascii="Microsoft YaHei" w:hAnsi="Microsoft YaHei" w:eastAsia="Microsoft YaHei" w:cs="Microsoft YaHei" w:csTheme="minorBidi"/>
           <w:sz w:val="21"/>
+          <w:szCs w:val="22"/>
         </w:rPr>
-        <w:t>主导 MXFP8、MXFP4 算法设计与实现，支撑 Qwen、DeepSeek、GLM、LongCat、Kimi、Minimax 等 20+ 权重在昇腾 A5 NPU 上线及客户送测；对 DeepSeek v4、Qwen3.5 实现 0-day 量化适配。精度相对浮点误差 &lt;1%，推理性能达竞品 1.x 倍，单模型适配约 1 天，整体调优周级完成。</w:t>
+        <w:t xml:space="preserve">主导 </w:t>
+      </w:r>
+      <w:r>
+        <w:rPr>
+          <w:rFonts w:ascii="Microsoft YaHei" w:hAnsi="Microsoft YaHei" w:eastAsia="Microsoft YaHei" w:cs="Microsoft YaHei" w:csTheme="minorBidi"/>
+          <w:b/>
+          <w:bCs/>
+          <w:sz w:val="21"/>
+          <w:szCs w:val="22"/>
+        </w:rPr>
+        <w:t>MXFP8、MXFP4</w:t>
+      </w:r>
+      <w:r>
+        <w:rPr>
+          <w:rFonts w:ascii="Microsoft YaHei" w:hAnsi="Microsoft YaHei" w:eastAsia="Microsoft YaHei" w:cs="Microsoft YaHei" w:csTheme="minorBidi"/>
+          <w:sz w:val="21"/>
+          <w:szCs w:val="22"/>
+        </w:rPr>
+        <w:t xml:space="preserve"> 算法设计与实现，支撑 Qwen、DeepSeek、GLM、LongCat、Kimi、Minimax 等 20+ 权重在昇腾 A5 NPU 上线及客户送测；对 DeepSeek v4、Qwen3.5 实现 0-day 量化适配。精度相对浮点误差 &lt;1%，推理性能达竞品 1.x 倍，单模型适配约 1 天，整体调优周级完成。</w:t>
       </w:r>
     </w:p>
     <w:p>
       <w:pPr>
         <w:pStyle w:val="ListBullet"/>
         <w:spacing w:after="60"/>
-        <w:ind w:left="283"/>
+        <w:ind w:left="283" w:hanging="360"/>
       </w:pPr>
       <w:r>
         <w:rPr>
-          <w:rFonts w:ascii="Microsoft YaHei" w:hAnsi="Microsoft YaHei" w:eastAsia="Microsoft YaHei"/>
+          <w:rFonts w:ascii="Microsoft YaHei" w:hAnsi="Microsoft YaHei" w:eastAsia="Microsoft YaHei" w:cs="Microsoft YaHei" w:csTheme="minorBidi"/>
           <w:b/>
+          <w:bCs/>
           <w:color w:val="003366"/>
           <w:sz w:val="21"/>
+          <w:szCs w:val="22"/>
         </w:rPr>
         <w:t>W4A4 低精度量化：</w:t>
       </w:r>
       <w:r>
         <w:rPr>
-          <w:rFonts w:ascii="Microsoft YaHei" w:hAnsi="Microsoft YaHei" w:eastAsia="Microsoft YaHei"/>
-          <w:b w:val="0"/>
+          <w:rFonts w:ascii="Microsoft YaHei" w:hAnsi="Microsoft YaHei" w:eastAsia="Microsoft YaHei" w:cs="Microsoft YaHei" w:csTheme="minorBidi"/>
           <w:sz w:val="21"/>
+          <w:szCs w:val="22"/>
         </w:rPr>
-        <w:t>主导 SVDQuant、二级量化、MSE Round、C7 等 4bit 方案，在开源多模态大模型 （Wan2.2、Qwen-Image-Edit等） 上完成 W4A4 量化；VBench or Gedit 精度指标误差均 &lt;0.01，推理性能达竞品 1.x 倍。</w:t>
+        <w:t xml:space="preserve">主导 </w:t>
+      </w:r>
+      <w:r>
+        <w:rPr>
+          <w:rFonts w:ascii="Microsoft YaHei" w:hAnsi="Microsoft YaHei" w:eastAsia="Microsoft YaHei" w:cs="Microsoft YaHei" w:csTheme="minorBidi"/>
+          <w:b/>
+          <w:bCs/>
+          <w:sz w:val="21"/>
+          <w:szCs w:val="22"/>
+        </w:rPr>
+        <w:t>SVDQuant、二级量化、MSE Round、C7</w:t>
+      </w:r>
+      <w:r>
+        <w:rPr>
+          <w:rFonts w:ascii="Microsoft YaHei" w:hAnsi="Microsoft YaHei" w:eastAsia="Microsoft YaHei" w:cs="Microsoft YaHei" w:csTheme="minorBidi"/>
+          <w:sz w:val="21"/>
+          <w:szCs w:val="22"/>
+        </w:rPr>
+        <w:t xml:space="preserve"> 等 4bit 方案，在开源多模态大模型 （Wan2.2、Qwen-Image-Edit等） 上完成 W4A4 量化；VBench or Gedit 精度指标误差均 &lt;0.01，推理性能达竞品 1.x 倍。</w:t>
       </w:r>
     </w:p>
     <w:p>
       <w:pPr>
         <w:pStyle w:val="ListBullet"/>
         <w:spacing w:after="60"/>
-        <w:ind w:left="283"/>
+        <w:ind w:left="283" w:hanging="360"/>
       </w:pPr>
       <w:r>
         <w:rPr>
-          <w:rFonts w:ascii="Microsoft YaHei" w:hAnsi="Microsoft YaHei" w:eastAsia="Microsoft YaHei"/>
+          <w:rFonts w:ascii="Microsoft YaHei" w:hAnsi="Microsoft YaHei" w:eastAsia="Microsoft YaHei" w:cs="Microsoft YaHei" w:csTheme="minorBidi"/>
           <w:b/>
+          <w:bCs/>
           <w:color w:val="003366"/>
           <w:sz w:val="21"/>
+          <w:szCs w:val="22"/>
         </w:rPr>
         <w:t>动态 PTQ 转换：</w:t>
       </w:r>
       <w:r>
         <w:rPr>
-          <w:rFonts w:ascii="Microsoft YaHei" w:hAnsi="Microsoft YaHei" w:eastAsia="Microsoft YaHei"/>
-          <w:b w:val="0"/>
+          <w:rFonts w:ascii="Microsoft YaHei" w:hAnsi="Microsoft YaHei" w:eastAsia="Microsoft YaHei" w:cs="Microsoft YaHei" w:csTheme="minorBidi"/>
           <w:sz w:val="21"/>
+          <w:szCs w:val="22"/>
         </w:rPr>
-        <w:t>实现 Model-free 权重转换能力，在 PTQ 动态场景下以轻量化流程完成权重量化，降低大模型迁移与推理部署成本。</w:t>
+        <w:t xml:space="preserve">实现 </w:t>
+      </w:r>
+      <w:r>
+        <w:rPr>
+          <w:rFonts w:ascii="Microsoft YaHei" w:hAnsi="Microsoft YaHei" w:eastAsia="Microsoft YaHei" w:cs="Microsoft YaHei" w:csTheme="minorBidi"/>
+          <w:b/>
+          <w:bCs/>
+          <w:sz w:val="21"/>
+          <w:szCs w:val="22"/>
+        </w:rPr>
+        <w:t>Model-free 权重转换</w:t>
+      </w:r>
+      <w:r>
+        <w:rPr>
+          <w:rFonts w:ascii="Microsoft YaHei" w:hAnsi="Microsoft YaHei" w:eastAsia="Microsoft YaHei" w:cs="Microsoft YaHei" w:csTheme="minorBidi"/>
+          <w:sz w:val="21"/>
+          <w:szCs w:val="22"/>
+        </w:rPr>
+        <w:t>能力，在 PTQ 动态场景下以轻量化流程完成权重量化，降低大模型迁移与推理部署成本。</w:t>
       </w:r>
     </w:p>
     <w:p>
       <w:pPr>
         <w:pStyle w:val="ListBullet"/>
         <w:spacing w:after="60"/>
-        <w:ind w:left="283"/>
+        <w:ind w:left="283" w:hanging="360"/>
       </w:pPr>
       <w:r>
         <w:rPr>
-          <w:rFonts w:ascii="Microsoft YaHei" w:hAnsi="Microsoft YaHei" w:eastAsia="Microsoft YaHei"/>
+          <w:rFonts w:ascii="Microsoft YaHei" w:hAnsi="Microsoft YaHei" w:eastAsia="Microsoft YaHei" w:cs="Microsoft YaHei" w:csTheme="minorBidi"/>
           <w:b/>
+          <w:bCs/>
           <w:color w:val="003366"/>
           <w:sz w:val="21"/>
+          <w:szCs w:val="22"/>
         </w:rPr>
         <w:t>端到端项目交付：</w:t>
       </w:r>
       <w:r>
         <w:rPr>
-          <w:rFonts w:ascii="Microsoft YaHei" w:hAnsi="Microsoft YaHei" w:eastAsia="Microsoft YaHei"/>
-          <w:b w:val="0"/>
+          <w:rFonts w:ascii="Microsoft YaHei" w:hAnsi="Microsoft YaHei" w:eastAsia="Microsoft YaHei" w:cs="Microsoft YaHei" w:csTheme="minorBidi"/>
           <w:sz w:val="21"/>
+          <w:szCs w:val="22"/>
         </w:rPr>
         <w:t>作为负责人协同推理引擎、量化算法、量化工具 4 个部门 20+ 人推进交付，保障客户面送测通过；相较上一代引入浮点量化体系并扩展 4bit 低精度算法矩阵，参与关键方案设计与路线决策。</w:t>
       </w:r>
@@ -211,24 +362,44 @@
       <w:pPr>
         <w:pStyle w:val="ListBullet"/>
         <w:spacing w:after="60"/>
-        <w:ind w:left="283"/>
+        <w:ind w:left="283" w:hanging="360"/>
       </w:pPr>
       <w:r>
         <w:rPr>
-          <w:rFonts w:ascii="Microsoft YaHei" w:hAnsi="Microsoft YaHei" w:eastAsia="Microsoft YaHei"/>
+          <w:rFonts w:ascii="Microsoft YaHei" w:hAnsi="Microsoft YaHei" w:eastAsia="Microsoft YaHei" w:cs="Microsoft YaHei" w:csTheme="minorBidi"/>
           <w:b/>
+          <w:bCs/>
           <w:color w:val="003366"/>
           <w:sz w:val="21"/>
+          <w:szCs w:val="22"/>
         </w:rPr>
         <w:t>投机推理：</w:t>
       </w:r>
       <w:r>
         <w:rPr>
-          <w:rFonts w:ascii="Microsoft YaHei" w:hAnsi="Microsoft YaHei" w:eastAsia="Microsoft YaHei"/>
-          <w:b w:val="0"/>
+          <w:rFonts w:ascii="Microsoft YaHei" w:hAnsi="Microsoft YaHei" w:eastAsia="Microsoft YaHei" w:cs="Microsoft YaHei" w:csTheme="minorBidi"/>
           <w:sz w:val="21"/>
+          <w:szCs w:val="22"/>
         </w:rPr>
-        <w:t>主要负责DeepSeek v4 flash/pro DSpark 权重的0 day 4bit量化适配。并且基于 DeepSeek 开源 DeepSpec，参与完成 910B npu芯片上的 DSpark 训练→GSM8K eval 全链路验证。</w:t>
+        <w:t xml:space="preserve">主要负责DeepSeek v4 flash/pro </w:t>
+      </w:r>
+      <w:r>
+        <w:rPr>
+          <w:rFonts w:ascii="Microsoft YaHei" w:hAnsi="Microsoft YaHei" w:eastAsia="Microsoft YaHei" w:cs="Microsoft YaHei" w:csTheme="minorBidi"/>
+          <w:b/>
+          <w:bCs/>
+          <w:sz w:val="21"/>
+          <w:szCs w:val="22"/>
+        </w:rPr>
+        <w:t>DSpark</w:t>
+      </w:r>
+      <w:r>
+        <w:rPr>
+          <w:rFonts w:ascii="Microsoft YaHei" w:hAnsi="Microsoft YaHei" w:eastAsia="Microsoft YaHei" w:cs="Microsoft YaHei" w:csTheme="minorBidi"/>
+          <w:sz w:val="21"/>
+          <w:szCs w:val="22"/>
+        </w:rPr>
+        <w:t xml:space="preserve"> 权重的0 day 4bit量化适配。并且基于 DeepSeek 开源 DeepSpec，参与完成 910B npu芯片上的 DSpark 训练→GSM8K eval 全链路验证。</w:t>
       </w:r>
     </w:p>
     <w:p>
@@ -237,9 +408,11 @@
       </w:pPr>
       <w:r>
         <w:rPr>
-          <w:rFonts w:ascii="Microsoft YaHei" w:hAnsi="Microsoft YaHei" w:eastAsia="Microsoft YaHei"/>
+          <w:rFonts w:ascii="Microsoft YaHei" w:hAnsi="Microsoft YaHei" w:eastAsia="Microsoft YaHei" w:cs="Microsoft YaHei" w:csTheme="minorBidi"/>
           <w:b/>
+          <w:bCs/>
           <w:sz w:val="21"/>
+          <w:szCs w:val="22"/>
         </w:rPr>
         <w:t>昇腾算子调试工具</w:t>
       </w:r>
@@ -248,22 +421,24 @@
       <w:pPr>
         <w:pStyle w:val="ListBullet"/>
         <w:spacing w:after="60"/>
-        <w:ind w:left="283"/>
+        <w:ind w:left="283" w:hanging="360"/>
       </w:pPr>
       <w:r>
         <w:rPr>
-          <w:rFonts w:ascii="Microsoft YaHei" w:hAnsi="Microsoft YaHei" w:eastAsia="Microsoft YaHei"/>
+          <w:rFonts w:ascii="Microsoft YaHei" w:hAnsi="Microsoft YaHei" w:eastAsia="Microsoft YaHei" w:cs="Microsoft YaHei" w:csTheme="minorBidi"/>
           <w:b/>
+          <w:bCs/>
           <w:color w:val="003366"/>
           <w:sz w:val="21"/>
+          <w:szCs w:val="22"/>
         </w:rPr>
         <w:t>上板调试与生态：</w:t>
       </w:r>
       <w:r>
         <w:rPr>
-          <w:rFonts w:ascii="Microsoft YaHei" w:hAnsi="Microsoft YaHei" w:eastAsia="Microsoft YaHei"/>
-          <w:b w:val="0"/>
+          <w:rFonts w:ascii="Microsoft YaHei" w:hAnsi="Microsoft YaHei" w:eastAsia="Microsoft YaHei" w:cs="Microsoft YaHei" w:csTheme="minorBidi"/>
           <w:sz w:val="21"/>
+          <w:szCs w:val="22"/>
         </w:rPr>
         <w:t>基于 LLDB 实现 NPU 断点、单步、变量打印及 coredump / 多 Kernel / 多卡调试，端到端打通真机调试流程；社区覆盖 1000+ 开发人员、20+ 活跃算子团队，算子精度与挂死类问题定位由数天缩短至小时级，开发效率提升数倍。</w:t>
       </w:r>
@@ -274,10 +449,10 @@
       </w:pPr>
       <w:r>
         <w:rPr>
-          <w:rFonts w:ascii="Microsoft YaHei" w:hAnsi="Microsoft YaHei" w:eastAsia="Microsoft YaHei"/>
-          <w:b w:val="0"/>
+          <w:rFonts w:ascii="Microsoft YaHei" w:hAnsi="Microsoft YaHei" w:eastAsia="Microsoft YaHei" w:cs="Microsoft YaHei" w:csTheme="minorBidi"/>
           <w:color w:val="555555"/>
           <w:sz w:val="19"/>
+          <w:szCs w:val="22"/>
         </w:rPr>
         <w:t>早期参与农机自动驾驶路径规划算法研发（专利 1 项）。</w:t>
       </w:r>
@@ -288,10 +463,12 @@
       </w:pPr>
       <w:r>
         <w:rPr>
-          <w:rFonts w:ascii="Microsoft YaHei" w:hAnsi="Microsoft YaHei" w:eastAsia="Microsoft YaHei"/>
+          <w:rFonts w:ascii="Microsoft YaHei" w:hAnsi="Microsoft YaHei" w:eastAsia="Microsoft YaHei" w:cs="Microsoft YaHei" w:csTheme="minorBidi"/>
           <w:b/>
+          <w:bCs/>
           <w:color w:val="003366"/>
           <w:sz w:val="22"/>
+          <w:szCs w:val="22"/>
         </w:rPr>
         <w:t>专业技能</w:t>
       </w:r>
@@ -302,18 +479,20 @@
       </w:pPr>
       <w:r>
         <w:rPr>
-          <w:rFonts w:ascii="Microsoft YaHei" w:hAnsi="Microsoft YaHei" w:eastAsia="Microsoft YaHei"/>
+          <w:rFonts w:ascii="Microsoft YaHei" w:hAnsi="Microsoft YaHei" w:eastAsia="Microsoft YaHei" w:cs="Microsoft YaHei" w:csTheme="minorBidi"/>
           <w:b/>
+          <w:bCs/>
           <w:color w:val="003366"/>
           <w:sz w:val="20"/>
+          <w:szCs w:val="22"/>
         </w:rPr>
         <w:t>编程基础：</w:t>
       </w:r>
       <w:r>
         <w:rPr>
-          <w:rFonts w:ascii="Microsoft YaHei" w:hAnsi="Microsoft YaHei" w:eastAsia="Microsoft YaHei"/>
-          <w:b w:val="0"/>
+          <w:rFonts w:ascii="Microsoft YaHei" w:hAnsi="Microsoft YaHei" w:eastAsia="Microsoft YaHei" w:cs="Microsoft YaHei" w:csTheme="minorBidi"/>
           <w:sz w:val="20"/>
+          <w:szCs w:val="22"/>
         </w:rPr>
         <w:t>Python，C++，熟悉常用数据结构与面向对象设计</w:t>
       </w:r>
@@ -324,18 +503,20 @@
       </w:pPr>
       <w:r>
         <w:rPr>
-          <w:rFonts w:ascii="Microsoft YaHei" w:hAnsi="Microsoft YaHei" w:eastAsia="Microsoft YaHei"/>
+          <w:rFonts w:ascii="Microsoft YaHei" w:hAnsi="Microsoft YaHei" w:eastAsia="Microsoft YaHei" w:cs="Microsoft YaHei" w:csTheme="minorBidi"/>
           <w:b/>
+          <w:bCs/>
           <w:color w:val="003366"/>
           <w:sz w:val="20"/>
+          <w:szCs w:val="22"/>
         </w:rPr>
         <w:t>深度学习：</w:t>
       </w:r>
       <w:r>
         <w:rPr>
-          <w:rFonts w:ascii="Microsoft YaHei" w:hAnsi="Microsoft YaHei" w:eastAsia="Microsoft YaHei"/>
-          <w:b w:val="0"/>
+          <w:rFonts w:ascii="Microsoft YaHei" w:hAnsi="Microsoft YaHei" w:eastAsia="Microsoft YaHei" w:cs="Microsoft YaHei" w:csTheme="minorBidi"/>
           <w:sz w:val="20"/>
+          <w:szCs w:val="22"/>
         </w:rPr>
         <w:t>PyTorch 大模型推理，核心模块 PTQ 量化与性能、精度调优</w:t>
       </w:r>
@@ -346,18 +527,20 @@
       </w:pPr>
       <w:r>
         <w:rPr>
-          <w:rFonts w:ascii="Microsoft YaHei" w:hAnsi="Microsoft YaHei" w:eastAsia="Microsoft YaHei"/>
+          <w:rFonts w:ascii="Microsoft YaHei" w:hAnsi="Microsoft YaHei" w:eastAsia="Microsoft YaHei" w:cs="Microsoft YaHei" w:csTheme="minorBidi"/>
           <w:b/>
+          <w:bCs/>
           <w:color w:val="003366"/>
           <w:sz w:val="20"/>
+          <w:szCs w:val="22"/>
         </w:rPr>
         <w:t>推理优化：</w:t>
       </w:r>
       <w:r>
         <w:rPr>
-          <w:rFonts w:ascii="Microsoft YaHei" w:hAnsi="Microsoft YaHei" w:eastAsia="Microsoft YaHei"/>
-          <w:b w:val="0"/>
+          <w:rFonts w:ascii="Microsoft YaHei" w:hAnsi="Microsoft YaHei" w:eastAsia="Microsoft YaHei" w:cs="Microsoft YaHei" w:csTheme="minorBidi"/>
           <w:sz w:val="20"/>
+          <w:szCs w:val="22"/>
         </w:rPr>
         <w:t>熟悉多种模型量化算法、离群值抑制、Quarot旋转等，Model-free 权重转换，推理引擎（vllm等）协同</w:t>
       </w:r>
@@ -368,18 +551,20 @@
       </w:pPr>
       <w:r>
         <w:rPr>
-          <w:rFonts w:ascii="Microsoft YaHei" w:hAnsi="Microsoft YaHei" w:eastAsia="Microsoft YaHei"/>
+          <w:rFonts w:ascii="Microsoft YaHei" w:hAnsi="Microsoft YaHei" w:eastAsia="Microsoft YaHei" w:cs="Microsoft YaHei" w:csTheme="minorBidi"/>
           <w:b/>
+          <w:bCs/>
           <w:color w:val="003366"/>
           <w:sz w:val="20"/>
+          <w:szCs w:val="22"/>
         </w:rPr>
         <w:t>算子开发：</w:t>
       </w:r>
       <w:r>
         <w:rPr>
-          <w:rFonts w:ascii="Microsoft YaHei" w:hAnsi="Microsoft YaHei" w:eastAsia="Microsoft YaHei"/>
-          <w:b w:val="0"/>
+          <w:rFonts w:ascii="Microsoft YaHei" w:hAnsi="Microsoft YaHei" w:eastAsia="Microsoft YaHei" w:cs="Microsoft YaHei" w:csTheme="minorBidi"/>
           <w:sz w:val="20"/>
+          <w:szCs w:val="22"/>
         </w:rPr>
         <w:t>Ascend C 算子开发与上板调试（NPU Debugger） 、量化算子实现</w:t>
       </w:r>
@@ -390,18 +575,20 @@
       </w:pPr>
       <w:r>
         <w:rPr>
-          <w:rFonts w:ascii="Microsoft YaHei" w:hAnsi="Microsoft YaHei" w:eastAsia="Microsoft YaHei"/>
+          <w:rFonts w:ascii="Microsoft YaHei" w:hAnsi="Microsoft YaHei" w:eastAsia="Microsoft YaHei" w:cs="Microsoft YaHei" w:csTheme="minorBidi"/>
           <w:b/>
+          <w:bCs/>
           <w:color w:val="003366"/>
           <w:sz w:val="20"/>
+          <w:szCs w:val="22"/>
         </w:rPr>
         <w:t>开发技能：</w:t>
       </w:r>
       <w:r>
         <w:rPr>
-          <w:rFonts w:ascii="Microsoft YaHei" w:hAnsi="Microsoft YaHei" w:eastAsia="Microsoft YaHei"/>
-          <w:b w:val="0"/>
+          <w:rFonts w:ascii="Microsoft YaHei" w:hAnsi="Microsoft YaHei" w:eastAsia="Microsoft YaHei" w:cs="Microsoft YaHei" w:csTheme="minorBidi"/>
           <w:sz w:val="20"/>
+          <w:szCs w:val="22"/>
         </w:rPr>
         <w:t>熟练使用agent开发，参与基于NPU的大模型量化agent工具（模型适配、量化调优、推理测评）</w:t>
       </w:r>
@@ -412,30 +599,38 @@
       </w:pPr>
       <w:r>
         <w:rPr>
-          <w:rFonts w:ascii="Microsoft YaHei" w:hAnsi="Microsoft YaHei" w:eastAsia="Microsoft YaHei"/>
+          <w:rFonts w:ascii="Microsoft YaHei" w:hAnsi="Microsoft YaHei" w:eastAsia="Microsoft YaHei" w:cs="Microsoft YaHei" w:csTheme="minorBidi"/>
           <w:b/>
+          <w:bCs/>
           <w:color w:val="003366"/>
           <w:sz w:val="22"/>
+          <w:szCs w:val="22"/>
         </w:rPr>
         <w:t>教育背景</w:t>
       </w:r>
     </w:p>
     <w:p>
+      <w:pPr>
+        <w:spacing w:after="200" w:line="276" w:lineRule="auto"/>
+      </w:pPr>
       <w:r>
         <w:rPr>
-          <w:rFonts w:ascii="Microsoft YaHei" w:hAnsi="Microsoft YaHei" w:eastAsia="Microsoft YaHei"/>
-          <w:b w:val="0"/>
+          <w:rFonts w:ascii="Microsoft YaHei" w:hAnsi="Microsoft YaHei" w:eastAsia="Microsoft YaHei" w:cs="Microsoft YaHei" w:csTheme="minorBidi"/>
           <w:sz w:val="21"/>
+          <w:szCs w:val="22"/>
         </w:rPr>
         <w:t>华东师范大学 · 计算机技术 · 硕士 · 2019 — 2022</w:t>
       </w:r>
     </w:p>
     <w:p>
+      <w:pPr>
+        <w:spacing w:after="200" w:line="276" w:lineRule="auto"/>
+      </w:pPr>
       <w:r>
         <w:rPr>
-          <w:rFonts w:ascii="Microsoft YaHei" w:hAnsi="Microsoft YaHei" w:eastAsia="Microsoft YaHei"/>
-          <w:b w:val="0"/>
+          <w:rFonts w:ascii="Microsoft YaHei" w:hAnsi="Microsoft YaHei" w:eastAsia="Microsoft YaHei" w:cs="Microsoft YaHei" w:csTheme="minorBidi"/>
           <w:sz w:val="21"/>
+          <w:szCs w:val="22"/>
         </w:rPr>
         <w:t>浙江工业大学 · 计算机科学与技术 · 本科 · 2015 — 2019</w:t>
       </w:r>
@@ -443,7 +638,6 @@
     <w:sectPr>
       <w:pgSz w:w="11906" w:h="16838"/>
       <w:pgMar w:top="1020" w:right="1134" w:bottom="1020" w:left="1134" w:header="720" w:footer="720" w:gutter="0"/>
-      <w:cols w:space="720"/>
       <w:docGrid w:linePitch="360"/>
     </w:sectPr>
   </w:body>

</xml_diff>